<commit_message>
Implement Event base class and Match polymorphism
</commit_message>
<xml_diff>
--- a/Dokumentacja.docx
+++ b/Dokumentacja.docx
@@ -10,7 +10,7 @@
           <w:sz w:val="20"/>
         </w:rPr>
         <w:drawing>
-          <wp:anchor distT="0" distB="0" distL="114300" distR="114300" simplePos="0" relativeHeight="251658240" behindDoc="0" locked="0" layoutInCell="1" allowOverlap="1" wp14:anchorId="3A8B36FD" wp14:editId="6E221FDF">
+          <wp:anchor distT="0" distB="0" distL="114300" distR="114300" simplePos="0" relativeHeight="251658240" behindDoc="0" locked="0" layoutInCell="1" allowOverlap="1" wp14:anchorId="3A8B36FD" wp14:editId="0C7029AC">
             <wp:simplePos x="0" y="0"/>
             <wp:positionH relativeFrom="margin">
               <wp:align>center</wp:align>
@@ -419,25 +419,7 @@
           <w:sz w:val="22"/>
           <w:szCs w:val="22"/>
         </w:rPr>
-        <w:t>2</w:t>
-      </w:r>
-      <w:r>
-        <w:rPr>
-          <w:b/>
-          <w:bCs/>
-          <w:sz w:val="22"/>
-          <w:szCs w:val="22"/>
-        </w:rPr>
-        <w:t xml:space="preserve">. </w:t>
-      </w:r>
-      <w:r>
-        <w:rPr>
-          <w:b/>
-          <w:bCs/>
-          <w:sz w:val="22"/>
-          <w:szCs w:val="22"/>
-        </w:rPr>
-        <w:t>Architektura i struktura obiektowa</w:t>
+        <w:t>2. Architektura i struktura obiektowa</w:t>
       </w:r>
     </w:p>
     <w:p>
@@ -467,50 +449,52 @@
         <w:spacing w:after="0" w:line="276" w:lineRule="auto"/>
         <w:jc w:val="both"/>
         <w:rPr>
-          <w:b/>
-          <w:bCs/>
-          <w:sz w:val="22"/>
-          <w:szCs w:val="22"/>
-        </w:rPr>
-      </w:pPr>
-      <w:r>
-        <w:rPr>
-          <w:sz w:val="20"/>
-          <w:szCs w:val="20"/>
-        </w:rPr>
-        <w:t xml:space="preserve">Dziedziczenie: klasa </w:t>
-      </w:r>
-      <w:r>
-        <w:rPr>
-          <w:i/>
-          <w:iCs/>
-          <w:sz w:val="20"/>
-          <w:szCs w:val="20"/>
-        </w:rPr>
-        <w:t>Mecz</w:t>
-      </w:r>
-      <w:r>
-        <w:rPr>
-          <w:sz w:val="20"/>
-          <w:szCs w:val="20"/>
-        </w:rPr>
-        <w:t xml:space="preserve"> dziedziczy po abstrakcyjnej klasie bazowej </w:t>
-      </w:r>
-      <w:r>
-        <w:rPr>
-          <w:i/>
-          <w:iCs/>
-          <w:sz w:val="20"/>
-          <w:szCs w:val="20"/>
-        </w:rPr>
-        <w:t>Wydarzenie,</w:t>
-      </w:r>
-      <w:r>
-        <w:rPr>
-          <w:sz w:val="20"/>
-          <w:szCs w:val="20"/>
-        </w:rPr>
-        <w:t xml:space="preserve"> przejmując jej cechy (np. datę)</w:t>
+          <w:sz w:val="20"/>
+          <w:szCs w:val="20"/>
+        </w:rPr>
+      </w:pPr>
+      <w:r>
+        <w:rPr>
+          <w:sz w:val="20"/>
+          <w:szCs w:val="20"/>
+        </w:rPr>
+        <w:t xml:space="preserve">Definiowanie klas i obiektów: podział całej logiki programu na niezależne byty (abstrakcje pojęć ze świata rzeczywistego, takie jak </w:t>
+      </w:r>
+      <w:r>
+        <w:rPr>
+          <w:i/>
+          <w:iCs/>
+          <w:sz w:val="20"/>
+          <w:szCs w:val="20"/>
+        </w:rPr>
+        <w:t xml:space="preserve">Liga, </w:t>
+      </w:r>
+      <w:proofErr w:type="spellStart"/>
+      <w:r>
+        <w:rPr>
+          <w:i/>
+          <w:iCs/>
+          <w:sz w:val="20"/>
+          <w:szCs w:val="20"/>
+        </w:rPr>
+        <w:t>Druzyna</w:t>
+      </w:r>
+      <w:proofErr w:type="spellEnd"/>
+      <w:r>
+        <w:rPr>
+          <w:i/>
+          <w:iCs/>
+          <w:sz w:val="20"/>
+          <w:szCs w:val="20"/>
+        </w:rPr>
+        <w:t>, Mecz</w:t>
+      </w:r>
+      <w:r>
+        <w:rPr>
+          <w:sz w:val="20"/>
+          <w:szCs w:val="20"/>
+        </w:rPr>
+        <w:t>), które posiadają własne stany oraz metody, tworząc spójnie współpracujący system</w:t>
       </w:r>
     </w:p>
     <w:p>
@@ -523,27 +507,25 @@
         <w:spacing w:after="0" w:line="276" w:lineRule="auto"/>
         <w:jc w:val="both"/>
         <w:rPr>
-          <w:b/>
-          <w:bCs/>
-          <w:sz w:val="22"/>
-          <w:szCs w:val="22"/>
-        </w:rPr>
-      </w:pPr>
-      <w:r>
-        <w:rPr>
-          <w:sz w:val="20"/>
-          <w:szCs w:val="20"/>
-        </w:rPr>
-        <w:t xml:space="preserve">Polimorfizm: metody wirtualne jak np. </w:t>
-      </w:r>
-      <w:r>
-        <w:rPr>
-          <w:i/>
-          <w:iCs/>
-          <w:sz w:val="20"/>
-          <w:szCs w:val="20"/>
-        </w:rPr>
-        <w:t>rozegraj()</w:t>
+          <w:sz w:val="20"/>
+          <w:szCs w:val="20"/>
+        </w:rPr>
+      </w:pPr>
+      <w:r>
+        <w:rPr>
+          <w:sz w:val="20"/>
+          <w:szCs w:val="20"/>
+        </w:rPr>
+        <w:t xml:space="preserve">Hermetyzacja: ukrycie kluczowych danych (np. zmiennych </w:t>
+      </w:r>
+      <w:r>
+        <w:rPr>
+          <w:i/>
+          <w:iCs/>
+          <w:sz w:val="20"/>
+          <w:szCs w:val="20"/>
+        </w:rPr>
+        <w:t>nazwa</w:t>
       </w:r>
       <w:r>
         <w:rPr>
@@ -552,6 +534,22 @@
         </w:rPr>
         <w:t xml:space="preserve"> czy </w:t>
       </w:r>
+      <w:r>
+        <w:rPr>
+          <w:i/>
+          <w:iCs/>
+          <w:sz w:val="20"/>
+          <w:szCs w:val="20"/>
+        </w:rPr>
+        <w:t xml:space="preserve">punkty </w:t>
+      </w:r>
+      <w:r>
+        <w:rPr>
+          <w:sz w:val="20"/>
+          <w:szCs w:val="20"/>
+        </w:rPr>
+        <w:t xml:space="preserve">w klasie </w:t>
+      </w:r>
       <w:proofErr w:type="spellStart"/>
       <w:r>
         <w:rPr>
@@ -560,24 +558,65 @@
           <w:sz w:val="20"/>
           <w:szCs w:val="20"/>
         </w:rPr>
-        <w:t>pobierzSzczegoly</w:t>
+        <w:t>Druzyna</w:t>
       </w:r>
       <w:proofErr w:type="spellEnd"/>
       <w:r>
         <w:rPr>
-          <w:i/>
-          <w:iCs/>
-          <w:sz w:val="20"/>
-          <w:szCs w:val="20"/>
-        </w:rPr>
-        <w:t>()</w:t>
-      </w:r>
-      <w:r>
-        <w:rPr>
-          <w:sz w:val="20"/>
-          <w:szCs w:val="20"/>
-        </w:rPr>
-        <w:t xml:space="preserve"> nadpisane w klasie pochodnej</w:t>
+          <w:sz w:val="20"/>
+          <w:szCs w:val="20"/>
+        </w:rPr>
+        <w:t xml:space="preserve"> oraz wektorów w klasie </w:t>
+      </w:r>
+      <w:r>
+        <w:rPr>
+          <w:i/>
+          <w:iCs/>
+          <w:sz w:val="20"/>
+          <w:szCs w:val="20"/>
+        </w:rPr>
+        <w:t>Liga</w:t>
+      </w:r>
+      <w:r>
+        <w:rPr>
+          <w:sz w:val="20"/>
+          <w:szCs w:val="20"/>
+        </w:rPr>
+        <w:t xml:space="preserve">) w sekcji </w:t>
+      </w:r>
+      <w:proofErr w:type="spellStart"/>
+      <w:r>
+        <w:rPr>
+          <w:i/>
+          <w:iCs/>
+          <w:sz w:val="20"/>
+          <w:szCs w:val="20"/>
+        </w:rPr>
+        <w:t>private</w:t>
+      </w:r>
+      <w:proofErr w:type="spellEnd"/>
+      <w:r>
+        <w:rPr>
+          <w:sz w:val="20"/>
+          <w:szCs w:val="20"/>
+        </w:rPr>
+        <w:t xml:space="preserve"> i kontrolowanie do nich dostępu wyłącznie za pomocą publicznych metod dostępowych (getterów i </w:t>
+      </w:r>
+      <w:proofErr w:type="spellStart"/>
+      <w:r>
+        <w:rPr>
+          <w:sz w:val="20"/>
+          <w:szCs w:val="20"/>
+        </w:rPr>
+        <w:t>setterów</w:t>
+      </w:r>
+      <w:proofErr w:type="spellEnd"/>
+      <w:r>
+        <w:rPr>
+          <w:sz w:val="20"/>
+          <w:szCs w:val="20"/>
+        </w:rPr>
+        <w:t>), co chroni stan obiektów przed niepowołaną modyfikacją z zewnątrz</w:t>
       </w:r>
     </w:p>
     <w:p>
@@ -601,32 +640,53 @@
           <w:sz w:val="20"/>
           <w:szCs w:val="20"/>
         </w:rPr>
-        <w:t xml:space="preserve">Kompozycja: klasa Interface ma silny związek ze swoimi wewnętrznymi obiektami </w:t>
-      </w:r>
-      <w:r>
-        <w:rPr>
-          <w:i/>
-          <w:iCs/>
-          <w:sz w:val="20"/>
-          <w:szCs w:val="20"/>
-        </w:rPr>
-        <w:t>Liga</w:t>
-      </w:r>
-      <w:r>
-        <w:rPr>
-          <w:sz w:val="20"/>
-          <w:szCs w:val="20"/>
-        </w:rPr>
-        <w:t xml:space="preserve"> oraz </w:t>
-      </w:r>
-      <w:r>
-        <w:rPr>
-          <w:i/>
-          <w:iCs/>
-          <w:sz w:val="20"/>
-          <w:szCs w:val="20"/>
-        </w:rPr>
-        <w:t>Dane</w:t>
+        <w:t xml:space="preserve">Dziedziczenie: klasa </w:t>
+      </w:r>
+      <w:r>
+        <w:rPr>
+          <w:i/>
+          <w:iCs/>
+          <w:sz w:val="20"/>
+          <w:szCs w:val="20"/>
+        </w:rPr>
+        <w:t>Mecz</w:t>
+      </w:r>
+      <w:r>
+        <w:rPr>
+          <w:sz w:val="20"/>
+          <w:szCs w:val="20"/>
+        </w:rPr>
+        <w:t xml:space="preserve"> dziedziczy po abstrakcyjnej klasie bazowej </w:t>
+      </w:r>
+      <w:r>
+        <w:rPr>
+          <w:i/>
+          <w:iCs/>
+          <w:sz w:val="20"/>
+          <w:szCs w:val="20"/>
+        </w:rPr>
+        <w:t>Wydarzenie,</w:t>
+      </w:r>
+      <w:r>
+        <w:rPr>
+          <w:sz w:val="20"/>
+          <w:szCs w:val="20"/>
+        </w:rPr>
+        <w:t xml:space="preserve"> przejmując jej cechy (np. datę</w:t>
+      </w:r>
+      <w:r>
+        <w:rPr>
+          <w:sz w:val="20"/>
+          <w:szCs w:val="20"/>
+        </w:rPr>
+        <w:t xml:space="preserve"> wydarzenia</w:t>
+      </w:r>
+      <w:r>
+        <w:rPr>
+          <w:sz w:val="20"/>
+          <w:szCs w:val="20"/>
+        </w:rPr>
+        <w:t>)</w:t>
       </w:r>
     </w:p>
     <w:p>
@@ -650,76 +710,50 @@
           <w:sz w:val="20"/>
           <w:szCs w:val="20"/>
         </w:rPr>
-        <w:t xml:space="preserve">Agregacja: </w:t>
-      </w:r>
-      <w:r>
-        <w:rPr>
-          <w:sz w:val="20"/>
-          <w:szCs w:val="20"/>
-        </w:rPr>
-        <w:t>k</w:t>
-      </w:r>
-      <w:r>
-        <w:rPr>
-          <w:sz w:val="20"/>
-          <w:szCs w:val="20"/>
-        </w:rPr>
-        <w:t>lasa</w:t>
-      </w:r>
-      <w:r>
-        <w:rPr>
-          <w:i/>
-          <w:iCs/>
-          <w:sz w:val="20"/>
-          <w:szCs w:val="20"/>
-        </w:rPr>
-        <w:t xml:space="preserve"> Mecz </w:t>
-      </w:r>
-      <w:r>
-        <w:rPr>
-          <w:sz w:val="20"/>
-          <w:szCs w:val="20"/>
-        </w:rPr>
-        <w:t xml:space="preserve">poprzez luźny związek z </w:t>
-      </w:r>
-      <w:r>
-        <w:rPr>
-          <w:sz w:val="20"/>
-          <w:szCs w:val="20"/>
-        </w:rPr>
-        <w:t>danymi ligowymi</w:t>
-      </w:r>
-      <w:r>
-        <w:rPr>
-          <w:i/>
-          <w:iCs/>
-          <w:sz w:val="20"/>
-          <w:szCs w:val="20"/>
-        </w:rPr>
-        <w:t xml:space="preserve"> </w:t>
-      </w:r>
-      <w:r>
-        <w:rPr>
-          <w:sz w:val="20"/>
-          <w:szCs w:val="20"/>
-        </w:rPr>
-        <w:t>przechowuje jedynie wskaźniki (</w:t>
-      </w:r>
-      <w:r>
-        <w:rPr>
-          <w:i/>
-          <w:iCs/>
-          <w:sz w:val="20"/>
-          <w:szCs w:val="20"/>
-        </w:rPr>
-        <w:t>*gospodarz, *gość</w:t>
-      </w:r>
-      <w:r>
-        <w:rPr>
-          <w:sz w:val="20"/>
-          <w:szCs w:val="20"/>
-        </w:rPr>
-        <w:t>) na niezależnie istniejące obiekty w wektorze ligi</w:t>
+        <w:t xml:space="preserve">Polimorfizm: metody wirtualne jak np. </w:t>
+      </w:r>
+      <w:r>
+        <w:rPr>
+          <w:i/>
+          <w:iCs/>
+          <w:sz w:val="20"/>
+          <w:szCs w:val="20"/>
+        </w:rPr>
+        <w:t>rozegraj()</w:t>
+      </w:r>
+      <w:r>
+        <w:rPr>
+          <w:sz w:val="20"/>
+          <w:szCs w:val="20"/>
+        </w:rPr>
+        <w:t xml:space="preserve"> czy </w:t>
+      </w:r>
+      <w:proofErr w:type="spellStart"/>
+      <w:r>
+        <w:rPr>
+          <w:i/>
+          <w:iCs/>
+          <w:sz w:val="20"/>
+          <w:szCs w:val="20"/>
+        </w:rPr>
+        <w:t>pobierzSzczegoly</w:t>
+      </w:r>
+      <w:proofErr w:type="spellEnd"/>
+      <w:r>
+        <w:rPr>
+          <w:i/>
+          <w:iCs/>
+          <w:sz w:val="20"/>
+          <w:szCs w:val="20"/>
+        </w:rPr>
+        <w:t>()</w:t>
+      </w:r>
+      <w:r>
+        <w:rPr>
+          <w:sz w:val="20"/>
+          <w:szCs w:val="20"/>
+        </w:rPr>
+        <w:t xml:space="preserve"> nadpisane w klasie pochodnej</w:t>
       </w:r>
     </w:p>
     <w:p>
@@ -743,25 +777,23 @@
           <w:sz w:val="20"/>
           <w:szCs w:val="20"/>
         </w:rPr>
-        <w:t xml:space="preserve">Obsługa wyjątków: zabezpieczenia w klasie </w:t>
-      </w:r>
-      <w:proofErr w:type="spellStart"/>
-      <w:r>
-        <w:rPr>
-          <w:i/>
-          <w:iCs/>
-          <w:sz w:val="20"/>
-          <w:szCs w:val="20"/>
-        </w:rPr>
-        <w:t>Druzyna</w:t>
-      </w:r>
-      <w:proofErr w:type="spellEnd"/>
-      <w:r>
-        <w:rPr>
-          <w:sz w:val="20"/>
-          <w:szCs w:val="20"/>
-        </w:rPr>
-        <w:t xml:space="preserve"> i </w:t>
+        <w:t xml:space="preserve">Kompozycja: klasa Interface ma silny związek ze swoimi wewnętrznymi obiektami </w:t>
+      </w:r>
+      <w:r>
+        <w:rPr>
+          <w:i/>
+          <w:iCs/>
+          <w:sz w:val="20"/>
+          <w:szCs w:val="20"/>
+        </w:rPr>
+        <w:t>Liga</w:t>
+      </w:r>
+      <w:r>
+        <w:rPr>
+          <w:sz w:val="20"/>
+          <w:szCs w:val="20"/>
+        </w:rPr>
+        <w:t xml:space="preserve"> oraz </w:t>
       </w:r>
       <w:r>
         <w:rPr>
@@ -772,129 +804,15 @@
         </w:rPr>
         <w:t>Dane</w:t>
       </w:r>
-      <w:r>
-        <w:rPr>
-          <w:i/>
-          <w:iCs/>
-          <w:sz w:val="20"/>
-          <w:szCs w:val="20"/>
-        </w:rPr>
-        <w:t xml:space="preserve"> </w:t>
-      </w:r>
-      <w:r>
-        <w:rPr>
-          <w:sz w:val="20"/>
-          <w:szCs w:val="20"/>
-        </w:rPr>
-        <w:t>rzucające wyjątki</w:t>
-      </w:r>
-      <w:r>
-        <w:rPr>
-          <w:sz w:val="20"/>
-          <w:szCs w:val="20"/>
-        </w:rPr>
-        <w:t>,</w:t>
-      </w:r>
-      <w:r>
-        <w:rPr>
-          <w:sz w:val="20"/>
-          <w:szCs w:val="20"/>
-        </w:rPr>
-        <w:t xml:space="preserve"> </w:t>
-      </w:r>
-      <w:r>
-        <w:rPr>
-          <w:sz w:val="20"/>
-          <w:szCs w:val="20"/>
-        </w:rPr>
-        <w:t>jak</w:t>
-      </w:r>
-      <w:r>
-        <w:rPr>
-          <w:i/>
-          <w:iCs/>
-          <w:sz w:val="20"/>
-          <w:szCs w:val="20"/>
-        </w:rPr>
-        <w:t xml:space="preserve"> invalid</w:t>
-      </w:r>
-      <w:proofErr w:type="spellStart"/>
-      <w:r>
-        <w:rPr>
-          <w:i/>
-          <w:iCs/>
-          <w:sz w:val="20"/>
-          <w:szCs w:val="20"/>
-        </w:rPr>
-        <w:t>_argument</w:t>
-      </w:r>
-      <w:proofErr w:type="spellEnd"/>
-      <w:r>
-        <w:rPr>
-          <w:i/>
-          <w:iCs/>
-          <w:sz w:val="20"/>
-          <w:szCs w:val="20"/>
-        </w:rPr>
-        <w:t xml:space="preserve"> </w:t>
-      </w:r>
-      <w:r>
-        <w:rPr>
-          <w:sz w:val="20"/>
-          <w:szCs w:val="20"/>
-        </w:rPr>
-        <w:t>czy</w:t>
-      </w:r>
-      <w:r>
-        <w:rPr>
-          <w:i/>
-          <w:iCs/>
-          <w:sz w:val="20"/>
-          <w:szCs w:val="20"/>
-        </w:rPr>
-        <w:t xml:space="preserve"> </w:t>
-      </w:r>
-      <w:proofErr w:type="spellStart"/>
-      <w:r>
-        <w:rPr>
-          <w:i/>
-          <w:iCs/>
-          <w:sz w:val="20"/>
-          <w:szCs w:val="20"/>
-        </w:rPr>
-        <w:t>runtime_error</w:t>
-      </w:r>
-      <w:proofErr w:type="spellEnd"/>
-      <w:r>
-        <w:rPr>
-          <w:i/>
-          <w:iCs/>
-          <w:sz w:val="20"/>
-          <w:szCs w:val="20"/>
-        </w:rPr>
-        <w:t xml:space="preserve"> </w:t>
-      </w:r>
-      <w:r>
-        <w:rPr>
-          <w:sz w:val="20"/>
-          <w:szCs w:val="20"/>
-        </w:rPr>
-        <w:t>przy błędnych danych wejściowych lub braku pliku</w:t>
-      </w:r>
-    </w:p>
-    <w:p>
-      <w:pPr>
-        <w:spacing w:after="0" w:line="360" w:lineRule="auto"/>
-        <w:jc w:val="both"/>
-        <w:rPr>
-          <w:b/>
-          <w:bCs/>
-        </w:rPr>
-      </w:pPr>
-    </w:p>
-    <w:p>
-      <w:pPr>
-        <w:spacing w:after="0" w:line="360" w:lineRule="auto"/>
+    </w:p>
+    <w:p>
+      <w:pPr>
+        <w:pStyle w:val="Akapitzlist"/>
+        <w:numPr>
+          <w:ilvl w:val="0"/>
+          <w:numId w:val="1"/>
+        </w:numPr>
+        <w:spacing w:after="0" w:line="276" w:lineRule="auto"/>
         <w:jc w:val="both"/>
         <w:rPr>
           <w:b/>
@@ -903,10 +821,227 @@
           <w:szCs w:val="22"/>
         </w:rPr>
       </w:pPr>
-    </w:p>
-    <w:p>
-      <w:pPr>
-        <w:spacing w:after="0" w:line="360" w:lineRule="auto"/>
+      <w:r>
+        <w:rPr>
+          <w:sz w:val="20"/>
+          <w:szCs w:val="20"/>
+        </w:rPr>
+        <w:t xml:space="preserve">Agregacja: </w:t>
+      </w:r>
+      <w:r>
+        <w:rPr>
+          <w:sz w:val="20"/>
+          <w:szCs w:val="20"/>
+        </w:rPr>
+        <w:t>k</w:t>
+      </w:r>
+      <w:r>
+        <w:rPr>
+          <w:sz w:val="20"/>
+          <w:szCs w:val="20"/>
+        </w:rPr>
+        <w:t>lasa</w:t>
+      </w:r>
+      <w:r>
+        <w:rPr>
+          <w:i/>
+          <w:iCs/>
+          <w:sz w:val="20"/>
+          <w:szCs w:val="20"/>
+        </w:rPr>
+        <w:t xml:space="preserve"> Mecz </w:t>
+      </w:r>
+      <w:r>
+        <w:rPr>
+          <w:sz w:val="20"/>
+          <w:szCs w:val="20"/>
+        </w:rPr>
+        <w:t xml:space="preserve">poprzez luźny związek z </w:t>
+      </w:r>
+      <w:r>
+        <w:rPr>
+          <w:sz w:val="20"/>
+          <w:szCs w:val="20"/>
+        </w:rPr>
+        <w:t>danymi ligowymi</w:t>
+      </w:r>
+      <w:r>
+        <w:rPr>
+          <w:i/>
+          <w:iCs/>
+          <w:sz w:val="20"/>
+          <w:szCs w:val="20"/>
+        </w:rPr>
+        <w:t xml:space="preserve"> </w:t>
+      </w:r>
+      <w:r>
+        <w:rPr>
+          <w:sz w:val="20"/>
+          <w:szCs w:val="20"/>
+        </w:rPr>
+        <w:t>przechowuje jedynie wskaźniki (</w:t>
+      </w:r>
+      <w:r>
+        <w:rPr>
+          <w:i/>
+          <w:iCs/>
+          <w:sz w:val="20"/>
+          <w:szCs w:val="20"/>
+        </w:rPr>
+        <w:t>*gospodarz, *gość</w:t>
+      </w:r>
+      <w:r>
+        <w:rPr>
+          <w:sz w:val="20"/>
+          <w:szCs w:val="20"/>
+        </w:rPr>
+        <w:t>) na niezależnie istniejące obiekty w wektorze ligi</w:t>
+      </w:r>
+    </w:p>
+    <w:p>
+      <w:pPr>
+        <w:pStyle w:val="Akapitzlist"/>
+        <w:numPr>
+          <w:ilvl w:val="0"/>
+          <w:numId w:val="1"/>
+        </w:numPr>
+        <w:spacing w:after="0" w:line="276" w:lineRule="auto"/>
+        <w:jc w:val="both"/>
+        <w:rPr>
+          <w:sz w:val="20"/>
+          <w:szCs w:val="20"/>
+        </w:rPr>
+      </w:pPr>
+      <w:r>
+        <w:rPr>
+          <w:sz w:val="20"/>
+          <w:szCs w:val="20"/>
+        </w:rPr>
+        <w:t xml:space="preserve">Typy generyczne: wykorzystanie szablonów (kontenerów z biblioteki standardowej STL), takich jak </w:t>
+      </w:r>
+      <w:proofErr w:type="spellStart"/>
+      <w:r>
+        <w:rPr>
+          <w:i/>
+          <w:iCs/>
+          <w:sz w:val="20"/>
+          <w:szCs w:val="20"/>
+        </w:rPr>
+        <w:t>std</w:t>
+      </w:r>
+      <w:proofErr w:type="spellEnd"/>
+      <w:r>
+        <w:rPr>
+          <w:i/>
+          <w:iCs/>
+          <w:sz w:val="20"/>
+          <w:szCs w:val="20"/>
+        </w:rPr>
+        <w:t>::</w:t>
+      </w:r>
+      <w:proofErr w:type="spellStart"/>
+      <w:r>
+        <w:rPr>
+          <w:i/>
+          <w:iCs/>
+          <w:sz w:val="20"/>
+          <w:szCs w:val="20"/>
+        </w:rPr>
+        <w:t>vector</w:t>
+      </w:r>
+      <w:proofErr w:type="spellEnd"/>
+      <w:r>
+        <w:rPr>
+          <w:i/>
+          <w:iCs/>
+          <w:sz w:val="20"/>
+          <w:szCs w:val="20"/>
+        </w:rPr>
+        <w:t>&lt;</w:t>
+      </w:r>
+      <w:proofErr w:type="spellStart"/>
+      <w:r>
+        <w:rPr>
+          <w:i/>
+          <w:iCs/>
+          <w:sz w:val="20"/>
+          <w:szCs w:val="20"/>
+        </w:rPr>
+        <w:t>Druzyna</w:t>
+      </w:r>
+      <w:proofErr w:type="spellEnd"/>
+      <w:r>
+        <w:rPr>
+          <w:i/>
+          <w:iCs/>
+          <w:sz w:val="20"/>
+          <w:szCs w:val="20"/>
+        </w:rPr>
+        <w:t>&gt;</w:t>
+      </w:r>
+      <w:r>
+        <w:rPr>
+          <w:sz w:val="20"/>
+          <w:szCs w:val="20"/>
+        </w:rPr>
+        <w:t xml:space="preserve"> czy </w:t>
+      </w:r>
+      <w:proofErr w:type="spellStart"/>
+      <w:r>
+        <w:rPr>
+          <w:i/>
+          <w:iCs/>
+          <w:sz w:val="20"/>
+          <w:szCs w:val="20"/>
+        </w:rPr>
+        <w:t>std</w:t>
+      </w:r>
+      <w:proofErr w:type="spellEnd"/>
+      <w:r>
+        <w:rPr>
+          <w:i/>
+          <w:iCs/>
+          <w:sz w:val="20"/>
+          <w:szCs w:val="20"/>
+        </w:rPr>
+        <w:t>::</w:t>
+      </w:r>
+      <w:proofErr w:type="spellStart"/>
+      <w:r>
+        <w:rPr>
+          <w:i/>
+          <w:iCs/>
+          <w:sz w:val="20"/>
+          <w:szCs w:val="20"/>
+        </w:rPr>
+        <w:t>vector</w:t>
+      </w:r>
+      <w:proofErr w:type="spellEnd"/>
+      <w:r>
+        <w:rPr>
+          <w:i/>
+          <w:iCs/>
+          <w:sz w:val="20"/>
+          <w:szCs w:val="20"/>
+        </w:rPr>
+        <w:t>&lt;Mecz&gt;,</w:t>
+      </w:r>
+      <w:r>
+        <w:rPr>
+          <w:sz w:val="20"/>
+          <w:szCs w:val="20"/>
+        </w:rPr>
+        <w:t xml:space="preserve"> pozwalających na elastyczne i w pełni bezpieczne typologicznie przechowywanie dynamicznych list obiektów</w:t>
+      </w:r>
+    </w:p>
+    <w:p>
+      <w:pPr>
+        <w:pStyle w:val="Akapitzlist"/>
+        <w:numPr>
+          <w:ilvl w:val="0"/>
+          <w:numId w:val="1"/>
+        </w:numPr>
+        <w:spacing w:after="0" w:line="276" w:lineRule="auto"/>
         <w:jc w:val="both"/>
         <w:rPr>
           <w:b/>
@@ -915,6 +1050,159 @@
           <w:szCs w:val="22"/>
         </w:rPr>
       </w:pPr>
+      <w:r>
+        <w:rPr>
+          <w:sz w:val="20"/>
+          <w:szCs w:val="20"/>
+        </w:rPr>
+        <w:t xml:space="preserve">Obsługa wyjątków: zabezpieczenia w klasie </w:t>
+      </w:r>
+      <w:proofErr w:type="spellStart"/>
+      <w:r>
+        <w:rPr>
+          <w:i/>
+          <w:iCs/>
+          <w:sz w:val="20"/>
+          <w:szCs w:val="20"/>
+        </w:rPr>
+        <w:t>Druzyna</w:t>
+      </w:r>
+      <w:proofErr w:type="spellEnd"/>
+      <w:r>
+        <w:rPr>
+          <w:sz w:val="20"/>
+          <w:szCs w:val="20"/>
+        </w:rPr>
+        <w:t xml:space="preserve"> i </w:t>
+      </w:r>
+      <w:r>
+        <w:rPr>
+          <w:i/>
+          <w:iCs/>
+          <w:sz w:val="20"/>
+          <w:szCs w:val="20"/>
+        </w:rPr>
+        <w:t>Dane</w:t>
+      </w:r>
+      <w:r>
+        <w:rPr>
+          <w:i/>
+          <w:iCs/>
+          <w:sz w:val="20"/>
+          <w:szCs w:val="20"/>
+        </w:rPr>
+        <w:t xml:space="preserve"> </w:t>
+      </w:r>
+      <w:r>
+        <w:rPr>
+          <w:sz w:val="20"/>
+          <w:szCs w:val="20"/>
+        </w:rPr>
+        <w:t>rzucające wyjątki</w:t>
+      </w:r>
+      <w:r>
+        <w:rPr>
+          <w:sz w:val="20"/>
+          <w:szCs w:val="20"/>
+        </w:rPr>
+        <w:t>,</w:t>
+      </w:r>
+      <w:r>
+        <w:rPr>
+          <w:sz w:val="20"/>
+          <w:szCs w:val="20"/>
+        </w:rPr>
+        <w:t xml:space="preserve"> </w:t>
+      </w:r>
+      <w:r>
+        <w:rPr>
+          <w:sz w:val="20"/>
+          <w:szCs w:val="20"/>
+        </w:rPr>
+        <w:t>jak</w:t>
+      </w:r>
+      <w:r>
+        <w:rPr>
+          <w:i/>
+          <w:iCs/>
+          <w:sz w:val="20"/>
+          <w:szCs w:val="20"/>
+        </w:rPr>
+        <w:t xml:space="preserve"> </w:t>
+      </w:r>
+      <w:proofErr w:type="spellStart"/>
+      <w:r>
+        <w:rPr>
+          <w:i/>
+          <w:iCs/>
+          <w:sz w:val="20"/>
+          <w:szCs w:val="20"/>
+        </w:rPr>
+        <w:t>invalid_argument</w:t>
+      </w:r>
+      <w:proofErr w:type="spellEnd"/>
+      <w:r>
+        <w:rPr>
+          <w:i/>
+          <w:iCs/>
+          <w:sz w:val="20"/>
+          <w:szCs w:val="20"/>
+        </w:rPr>
+        <w:t xml:space="preserve"> </w:t>
+      </w:r>
+      <w:r>
+        <w:rPr>
+          <w:sz w:val="20"/>
+          <w:szCs w:val="20"/>
+        </w:rPr>
+        <w:t>czy</w:t>
+      </w:r>
+      <w:r>
+        <w:rPr>
+          <w:i/>
+          <w:iCs/>
+          <w:sz w:val="20"/>
+          <w:szCs w:val="20"/>
+        </w:rPr>
+        <w:t xml:space="preserve"> </w:t>
+      </w:r>
+      <w:proofErr w:type="spellStart"/>
+      <w:r>
+        <w:rPr>
+          <w:i/>
+          <w:iCs/>
+          <w:sz w:val="20"/>
+          <w:szCs w:val="20"/>
+        </w:rPr>
+        <w:t>runtime_error</w:t>
+      </w:r>
+      <w:proofErr w:type="spellEnd"/>
+      <w:r>
+        <w:rPr>
+          <w:i/>
+          <w:iCs/>
+          <w:sz w:val="20"/>
+          <w:szCs w:val="20"/>
+        </w:rPr>
+        <w:t xml:space="preserve"> </w:t>
+      </w:r>
+      <w:r>
+        <w:rPr>
+          <w:sz w:val="20"/>
+          <w:szCs w:val="20"/>
+        </w:rPr>
+        <w:t>przy błędnych danych wejściowych lub braku pliku</w:t>
+      </w:r>
+    </w:p>
+    <w:p>
+      <w:pPr>
+        <w:spacing w:after="0" w:line="360" w:lineRule="auto"/>
+        <w:jc w:val="both"/>
+        <w:rPr>
+          <w:b/>
+          <w:bCs/>
+        </w:rPr>
+      </w:pPr>
     </w:p>
     <w:p>
       <w:pPr>
@@ -943,6 +1231,7 @@
     <w:p>
       <w:pPr>
         <w:spacing w:after="0" w:line="360" w:lineRule="auto"/>
+        <w:ind w:left="0" w:firstLine="0"/>
         <w:jc w:val="both"/>
         <w:rPr>
           <w:b/>
@@ -951,119 +1240,22 @@
           <w:szCs w:val="22"/>
         </w:rPr>
       </w:pPr>
-    </w:p>
-    <w:p>
-      <w:pPr>
-        <w:spacing w:after="0" w:line="360" w:lineRule="auto"/>
-        <w:jc w:val="both"/>
-        <w:rPr>
-          <w:b/>
-          <w:bCs/>
-          <w:sz w:val="22"/>
-          <w:szCs w:val="22"/>
-        </w:rPr>
-      </w:pPr>
-    </w:p>
-    <w:p>
-      <w:pPr>
-        <w:spacing w:after="0" w:line="360" w:lineRule="auto"/>
-        <w:jc w:val="both"/>
-        <w:rPr>
-          <w:b/>
-          <w:bCs/>
-          <w:sz w:val="22"/>
-          <w:szCs w:val="22"/>
-        </w:rPr>
-      </w:pPr>
-    </w:p>
-    <w:p>
-      <w:pPr>
-        <w:spacing w:after="0" w:line="360" w:lineRule="auto"/>
-        <w:jc w:val="both"/>
-        <w:rPr>
-          <w:b/>
-          <w:bCs/>
-          <w:sz w:val="22"/>
-          <w:szCs w:val="22"/>
-        </w:rPr>
-      </w:pPr>
-    </w:p>
-    <w:p>
-      <w:pPr>
-        <w:spacing w:after="0" w:line="360" w:lineRule="auto"/>
-        <w:jc w:val="both"/>
-        <w:rPr>
-          <w:b/>
-          <w:bCs/>
-          <w:sz w:val="22"/>
-          <w:szCs w:val="22"/>
-        </w:rPr>
-      </w:pPr>
-      <w:r>
-        <w:rPr>
-          <w:b/>
-          <w:bCs/>
-          <w:sz w:val="22"/>
-          <w:szCs w:val="22"/>
-        </w:rPr>
-        <w:lastRenderedPageBreak/>
-        <w:t>3</w:t>
-      </w:r>
-      <w:r>
-        <w:rPr>
-          <w:b/>
-          <w:bCs/>
-          <w:sz w:val="22"/>
-          <w:szCs w:val="22"/>
-        </w:rPr>
-        <w:t xml:space="preserve">. </w:t>
-      </w:r>
-      <w:r>
-        <w:rPr>
-          <w:b/>
-          <w:bCs/>
-          <w:sz w:val="22"/>
-          <w:szCs w:val="22"/>
-        </w:rPr>
-        <w:t>Diagram UML</w:t>
-      </w:r>
-    </w:p>
-    <w:p>
-      <w:pPr>
-        <w:spacing w:after="0" w:line="240" w:lineRule="auto"/>
-        <w:rPr>
-          <w:i/>
-          <w:iCs/>
-          <w:sz w:val="20"/>
-          <w:szCs w:val="20"/>
-        </w:rPr>
-      </w:pPr>
-    </w:p>
-    <w:p>
-      <w:pPr>
-        <w:spacing w:after="0" w:line="240" w:lineRule="auto"/>
-        <w:rPr>
-          <w:i/>
-          <w:iCs/>
-          <w:sz w:val="20"/>
-          <w:szCs w:val="20"/>
-        </w:rPr>
-      </w:pPr>
-      <w:r>
-        <w:rPr>
-          <w:i/>
-          <w:iCs/>
+      <w:r>
+        <w:rPr>
+          <w:i/>
+          <w:iCs/>
+          <w:noProof/>
           <w:sz w:val="20"/>
           <w:szCs w:val="20"/>
         </w:rPr>
         <w:drawing>
-          <wp:anchor distT="0" distB="0" distL="114300" distR="114300" simplePos="0" relativeHeight="251659264" behindDoc="0" locked="0" layoutInCell="1" allowOverlap="1" wp14:anchorId="28948B8E" wp14:editId="4CFB1653">
+          <wp:anchor distT="0" distB="0" distL="114300" distR="114300" simplePos="0" relativeHeight="251659264" behindDoc="0" locked="0" layoutInCell="1" allowOverlap="1" wp14:anchorId="28948B8E" wp14:editId="44545F5E">
             <wp:simplePos x="0" y="0"/>
             <wp:positionH relativeFrom="margin">
-              <wp:posOffset>851535</wp:posOffset>
+              <wp:align>center</wp:align>
             </wp:positionH>
             <wp:positionV relativeFrom="margin">
-              <wp:posOffset>438150</wp:posOffset>
+              <wp:posOffset>657225</wp:posOffset>
             </wp:positionV>
             <wp:extent cx="3956050" cy="8892540"/>
             <wp:effectExtent l="0" t="0" r="6350" b="3810"/>
@@ -1113,6 +1305,817 @@
           </wp:anchor>
         </w:drawing>
       </w:r>
+      <w:r>
+        <w:rPr>
+          <w:b/>
+          <w:bCs/>
+          <w:sz w:val="22"/>
+          <w:szCs w:val="22"/>
+        </w:rPr>
+        <w:t>3. Diagram UML</w:t>
+      </w:r>
+    </w:p>
+    <w:p>
+      <w:pPr>
+        <w:spacing w:after="0" w:line="240" w:lineRule="auto"/>
+        <w:rPr>
+          <w:i/>
+          <w:iCs/>
+          <w:sz w:val="20"/>
+          <w:szCs w:val="20"/>
+        </w:rPr>
+      </w:pPr>
+    </w:p>
+    <w:p>
+      <w:pPr>
+        <w:spacing w:after="0" w:line="240" w:lineRule="auto"/>
+        <w:rPr>
+          <w:i/>
+          <w:iCs/>
+          <w:sz w:val="20"/>
+          <w:szCs w:val="20"/>
+        </w:rPr>
+      </w:pPr>
+    </w:p>
+    <w:p>
+      <w:pPr>
+        <w:spacing w:after="0" w:line="240" w:lineRule="auto"/>
+        <w:rPr>
+          <w:i/>
+          <w:iCs/>
+          <w:sz w:val="20"/>
+          <w:szCs w:val="20"/>
+        </w:rPr>
+      </w:pPr>
+    </w:p>
+    <w:p>
+      <w:pPr>
+        <w:spacing w:after="0" w:line="240" w:lineRule="auto"/>
+        <w:rPr>
+          <w:i/>
+          <w:iCs/>
+          <w:sz w:val="20"/>
+          <w:szCs w:val="20"/>
+        </w:rPr>
+      </w:pPr>
+    </w:p>
+    <w:p>
+      <w:pPr>
+        <w:spacing w:after="0" w:line="240" w:lineRule="auto"/>
+        <w:rPr>
+          <w:i/>
+          <w:iCs/>
+          <w:sz w:val="20"/>
+          <w:szCs w:val="20"/>
+        </w:rPr>
+      </w:pPr>
+    </w:p>
+    <w:p>
+      <w:pPr>
+        <w:spacing w:after="0" w:line="240" w:lineRule="auto"/>
+        <w:rPr>
+          <w:i/>
+          <w:iCs/>
+          <w:sz w:val="20"/>
+          <w:szCs w:val="20"/>
+        </w:rPr>
+      </w:pPr>
+    </w:p>
+    <w:p>
+      <w:pPr>
+        <w:spacing w:after="0" w:line="240" w:lineRule="auto"/>
+        <w:rPr>
+          <w:i/>
+          <w:iCs/>
+          <w:sz w:val="20"/>
+          <w:szCs w:val="20"/>
+        </w:rPr>
+      </w:pPr>
+    </w:p>
+    <w:p>
+      <w:pPr>
+        <w:spacing w:after="0" w:line="240" w:lineRule="auto"/>
+        <w:rPr>
+          <w:i/>
+          <w:iCs/>
+          <w:sz w:val="20"/>
+          <w:szCs w:val="20"/>
+        </w:rPr>
+      </w:pPr>
+    </w:p>
+    <w:p>
+      <w:pPr>
+        <w:spacing w:after="0" w:line="240" w:lineRule="auto"/>
+        <w:rPr>
+          <w:i/>
+          <w:iCs/>
+          <w:sz w:val="20"/>
+          <w:szCs w:val="20"/>
+        </w:rPr>
+      </w:pPr>
+    </w:p>
+    <w:p>
+      <w:pPr>
+        <w:spacing w:after="0" w:line="240" w:lineRule="auto"/>
+        <w:rPr>
+          <w:i/>
+          <w:iCs/>
+          <w:sz w:val="20"/>
+          <w:szCs w:val="20"/>
+        </w:rPr>
+      </w:pPr>
+    </w:p>
+    <w:p>
+      <w:pPr>
+        <w:spacing w:after="0" w:line="240" w:lineRule="auto"/>
+        <w:rPr>
+          <w:i/>
+          <w:iCs/>
+          <w:sz w:val="20"/>
+          <w:szCs w:val="20"/>
+        </w:rPr>
+      </w:pPr>
+    </w:p>
+    <w:p>
+      <w:pPr>
+        <w:spacing w:after="0" w:line="240" w:lineRule="auto"/>
+        <w:rPr>
+          <w:i/>
+          <w:iCs/>
+          <w:sz w:val="20"/>
+          <w:szCs w:val="20"/>
+        </w:rPr>
+      </w:pPr>
+    </w:p>
+    <w:p>
+      <w:pPr>
+        <w:spacing w:after="0" w:line="240" w:lineRule="auto"/>
+        <w:rPr>
+          <w:i/>
+          <w:iCs/>
+          <w:sz w:val="20"/>
+          <w:szCs w:val="20"/>
+        </w:rPr>
+      </w:pPr>
+    </w:p>
+    <w:p>
+      <w:pPr>
+        <w:spacing w:after="0" w:line="240" w:lineRule="auto"/>
+        <w:rPr>
+          <w:i/>
+          <w:iCs/>
+          <w:sz w:val="20"/>
+          <w:szCs w:val="20"/>
+        </w:rPr>
+      </w:pPr>
+    </w:p>
+    <w:p>
+      <w:pPr>
+        <w:spacing w:after="0" w:line="240" w:lineRule="auto"/>
+        <w:rPr>
+          <w:i/>
+          <w:iCs/>
+          <w:sz w:val="20"/>
+          <w:szCs w:val="20"/>
+        </w:rPr>
+      </w:pPr>
+    </w:p>
+    <w:p>
+      <w:pPr>
+        <w:spacing w:after="0" w:line="240" w:lineRule="auto"/>
+        <w:rPr>
+          <w:i/>
+          <w:iCs/>
+          <w:sz w:val="20"/>
+          <w:szCs w:val="20"/>
+        </w:rPr>
+      </w:pPr>
+    </w:p>
+    <w:p>
+      <w:pPr>
+        <w:spacing w:after="0" w:line="240" w:lineRule="auto"/>
+        <w:rPr>
+          <w:i/>
+          <w:iCs/>
+          <w:sz w:val="20"/>
+          <w:szCs w:val="20"/>
+        </w:rPr>
+      </w:pPr>
+    </w:p>
+    <w:p>
+      <w:pPr>
+        <w:spacing w:after="0" w:line="240" w:lineRule="auto"/>
+        <w:rPr>
+          <w:i/>
+          <w:iCs/>
+          <w:sz w:val="20"/>
+          <w:szCs w:val="20"/>
+        </w:rPr>
+      </w:pPr>
+    </w:p>
+    <w:p>
+      <w:pPr>
+        <w:spacing w:after="0" w:line="240" w:lineRule="auto"/>
+        <w:rPr>
+          <w:i/>
+          <w:iCs/>
+          <w:sz w:val="20"/>
+          <w:szCs w:val="20"/>
+        </w:rPr>
+      </w:pPr>
+    </w:p>
+    <w:p>
+      <w:pPr>
+        <w:spacing w:after="0" w:line="240" w:lineRule="auto"/>
+        <w:rPr>
+          <w:i/>
+          <w:iCs/>
+          <w:sz w:val="20"/>
+          <w:szCs w:val="20"/>
+        </w:rPr>
+      </w:pPr>
+    </w:p>
+    <w:p>
+      <w:pPr>
+        <w:spacing w:after="0" w:line="240" w:lineRule="auto"/>
+        <w:rPr>
+          <w:i/>
+          <w:iCs/>
+          <w:sz w:val="20"/>
+          <w:szCs w:val="20"/>
+        </w:rPr>
+      </w:pPr>
+    </w:p>
+    <w:p>
+      <w:pPr>
+        <w:spacing w:after="0" w:line="240" w:lineRule="auto"/>
+        <w:rPr>
+          <w:i/>
+          <w:iCs/>
+          <w:sz w:val="20"/>
+          <w:szCs w:val="20"/>
+        </w:rPr>
+      </w:pPr>
+    </w:p>
+    <w:p>
+      <w:pPr>
+        <w:spacing w:after="0" w:line="240" w:lineRule="auto"/>
+        <w:rPr>
+          <w:i/>
+          <w:iCs/>
+          <w:sz w:val="20"/>
+          <w:szCs w:val="20"/>
+        </w:rPr>
+      </w:pPr>
+    </w:p>
+    <w:p>
+      <w:pPr>
+        <w:spacing w:after="0" w:line="240" w:lineRule="auto"/>
+        <w:rPr>
+          <w:i/>
+          <w:iCs/>
+          <w:sz w:val="20"/>
+          <w:szCs w:val="20"/>
+        </w:rPr>
+      </w:pPr>
+    </w:p>
+    <w:p>
+      <w:pPr>
+        <w:spacing w:after="0" w:line="240" w:lineRule="auto"/>
+        <w:rPr>
+          <w:i/>
+          <w:iCs/>
+          <w:sz w:val="20"/>
+          <w:szCs w:val="20"/>
+        </w:rPr>
+      </w:pPr>
+    </w:p>
+    <w:p>
+      <w:pPr>
+        <w:spacing w:after="0" w:line="240" w:lineRule="auto"/>
+        <w:rPr>
+          <w:i/>
+          <w:iCs/>
+          <w:sz w:val="20"/>
+          <w:szCs w:val="20"/>
+        </w:rPr>
+      </w:pPr>
+    </w:p>
+    <w:p>
+      <w:pPr>
+        <w:spacing w:after="0" w:line="240" w:lineRule="auto"/>
+        <w:rPr>
+          <w:i/>
+          <w:iCs/>
+          <w:sz w:val="20"/>
+          <w:szCs w:val="20"/>
+        </w:rPr>
+      </w:pPr>
+    </w:p>
+    <w:p>
+      <w:pPr>
+        <w:spacing w:after="0" w:line="240" w:lineRule="auto"/>
+        <w:rPr>
+          <w:i/>
+          <w:iCs/>
+          <w:sz w:val="20"/>
+          <w:szCs w:val="20"/>
+        </w:rPr>
+      </w:pPr>
+    </w:p>
+    <w:p>
+      <w:pPr>
+        <w:spacing w:after="0" w:line="240" w:lineRule="auto"/>
+        <w:rPr>
+          <w:i/>
+          <w:iCs/>
+          <w:sz w:val="20"/>
+          <w:szCs w:val="20"/>
+        </w:rPr>
+      </w:pPr>
+    </w:p>
+    <w:p>
+      <w:pPr>
+        <w:spacing w:after="0" w:line="240" w:lineRule="auto"/>
+        <w:rPr>
+          <w:i/>
+          <w:iCs/>
+          <w:sz w:val="20"/>
+          <w:szCs w:val="20"/>
+        </w:rPr>
+      </w:pPr>
+    </w:p>
+    <w:p>
+      <w:pPr>
+        <w:spacing w:after="0" w:line="240" w:lineRule="auto"/>
+        <w:rPr>
+          <w:i/>
+          <w:iCs/>
+          <w:sz w:val="20"/>
+          <w:szCs w:val="20"/>
+        </w:rPr>
+      </w:pPr>
+    </w:p>
+    <w:p>
+      <w:pPr>
+        <w:spacing w:after="0" w:line="240" w:lineRule="auto"/>
+        <w:rPr>
+          <w:i/>
+          <w:iCs/>
+          <w:sz w:val="20"/>
+          <w:szCs w:val="20"/>
+        </w:rPr>
+      </w:pPr>
+    </w:p>
+    <w:p>
+      <w:pPr>
+        <w:spacing w:after="0" w:line="240" w:lineRule="auto"/>
+        <w:rPr>
+          <w:i/>
+          <w:iCs/>
+          <w:sz w:val="20"/>
+          <w:szCs w:val="20"/>
+        </w:rPr>
+      </w:pPr>
+    </w:p>
+    <w:p>
+      <w:pPr>
+        <w:spacing w:after="0" w:line="240" w:lineRule="auto"/>
+        <w:rPr>
+          <w:i/>
+          <w:iCs/>
+          <w:sz w:val="20"/>
+          <w:szCs w:val="20"/>
+        </w:rPr>
+      </w:pPr>
+    </w:p>
+    <w:p>
+      <w:pPr>
+        <w:spacing w:after="0" w:line="240" w:lineRule="auto"/>
+        <w:rPr>
+          <w:sz w:val="20"/>
+          <w:szCs w:val="20"/>
+        </w:rPr>
+      </w:pPr>
+    </w:p>
+    <w:p>
+      <w:pPr>
+        <w:spacing w:after="0" w:line="240" w:lineRule="auto"/>
+        <w:rPr>
+          <w:sz w:val="20"/>
+          <w:szCs w:val="20"/>
+        </w:rPr>
+      </w:pPr>
+    </w:p>
+    <w:p>
+      <w:pPr>
+        <w:spacing w:after="0" w:line="240" w:lineRule="auto"/>
+        <w:rPr>
+          <w:sz w:val="20"/>
+          <w:szCs w:val="20"/>
+        </w:rPr>
+      </w:pPr>
+    </w:p>
+    <w:p>
+      <w:pPr>
+        <w:spacing w:after="0" w:line="240" w:lineRule="auto"/>
+        <w:rPr>
+          <w:sz w:val="20"/>
+          <w:szCs w:val="20"/>
+        </w:rPr>
+      </w:pPr>
+    </w:p>
+    <w:p>
+      <w:pPr>
+        <w:spacing w:after="0" w:line="240" w:lineRule="auto"/>
+        <w:rPr>
+          <w:sz w:val="20"/>
+          <w:szCs w:val="20"/>
+        </w:rPr>
+      </w:pPr>
+    </w:p>
+    <w:p>
+      <w:pPr>
+        <w:spacing w:after="0" w:line="240" w:lineRule="auto"/>
+        <w:rPr>
+          <w:sz w:val="20"/>
+          <w:szCs w:val="20"/>
+        </w:rPr>
+      </w:pPr>
+    </w:p>
+    <w:p>
+      <w:pPr>
+        <w:spacing w:after="0" w:line="240" w:lineRule="auto"/>
+        <w:rPr>
+          <w:sz w:val="20"/>
+          <w:szCs w:val="20"/>
+        </w:rPr>
+      </w:pPr>
+    </w:p>
+    <w:p>
+      <w:pPr>
+        <w:spacing w:after="0" w:line="240" w:lineRule="auto"/>
+        <w:rPr>
+          <w:sz w:val="20"/>
+          <w:szCs w:val="20"/>
+        </w:rPr>
+      </w:pPr>
+    </w:p>
+    <w:p>
+      <w:pPr>
+        <w:spacing w:after="0" w:line="240" w:lineRule="auto"/>
+        <w:rPr>
+          <w:sz w:val="20"/>
+          <w:szCs w:val="20"/>
+        </w:rPr>
+      </w:pPr>
+    </w:p>
+    <w:p>
+      <w:pPr>
+        <w:spacing w:after="0" w:line="240" w:lineRule="auto"/>
+        <w:rPr>
+          <w:sz w:val="20"/>
+          <w:szCs w:val="20"/>
+        </w:rPr>
+      </w:pPr>
+    </w:p>
+    <w:p>
+      <w:pPr>
+        <w:spacing w:after="0" w:line="240" w:lineRule="auto"/>
+        <w:rPr>
+          <w:sz w:val="20"/>
+          <w:szCs w:val="20"/>
+        </w:rPr>
+      </w:pPr>
+    </w:p>
+    <w:p>
+      <w:pPr>
+        <w:spacing w:after="0" w:line="240" w:lineRule="auto"/>
+        <w:rPr>
+          <w:sz w:val="20"/>
+          <w:szCs w:val="20"/>
+        </w:rPr>
+      </w:pPr>
+    </w:p>
+    <w:p>
+      <w:pPr>
+        <w:spacing w:after="0" w:line="240" w:lineRule="auto"/>
+        <w:rPr>
+          <w:sz w:val="20"/>
+          <w:szCs w:val="20"/>
+        </w:rPr>
+      </w:pPr>
+    </w:p>
+    <w:p>
+      <w:pPr>
+        <w:spacing w:after="0" w:line="240" w:lineRule="auto"/>
+        <w:rPr>
+          <w:sz w:val="20"/>
+          <w:szCs w:val="20"/>
+        </w:rPr>
+      </w:pPr>
+    </w:p>
+    <w:p>
+      <w:pPr>
+        <w:spacing w:after="0" w:line="240" w:lineRule="auto"/>
+        <w:rPr>
+          <w:sz w:val="20"/>
+          <w:szCs w:val="20"/>
+        </w:rPr>
+      </w:pPr>
+    </w:p>
+    <w:p>
+      <w:pPr>
+        <w:spacing w:after="0" w:line="240" w:lineRule="auto"/>
+        <w:rPr>
+          <w:sz w:val="20"/>
+          <w:szCs w:val="20"/>
+        </w:rPr>
+      </w:pPr>
+    </w:p>
+    <w:p>
+      <w:pPr>
+        <w:spacing w:after="0" w:line="240" w:lineRule="auto"/>
+        <w:rPr>
+          <w:sz w:val="20"/>
+          <w:szCs w:val="20"/>
+        </w:rPr>
+      </w:pPr>
+    </w:p>
+    <w:p>
+      <w:pPr>
+        <w:spacing w:after="0" w:line="240" w:lineRule="auto"/>
+        <w:rPr>
+          <w:sz w:val="20"/>
+          <w:szCs w:val="20"/>
+        </w:rPr>
+      </w:pPr>
+    </w:p>
+    <w:p>
+      <w:pPr>
+        <w:spacing w:after="0" w:line="240" w:lineRule="auto"/>
+        <w:rPr>
+          <w:sz w:val="20"/>
+          <w:szCs w:val="20"/>
+        </w:rPr>
+      </w:pPr>
+    </w:p>
+    <w:p>
+      <w:pPr>
+        <w:spacing w:after="0" w:line="240" w:lineRule="auto"/>
+        <w:rPr>
+          <w:sz w:val="20"/>
+          <w:szCs w:val="20"/>
+        </w:rPr>
+      </w:pPr>
+    </w:p>
+    <w:p>
+      <w:pPr>
+        <w:spacing w:after="0" w:line="240" w:lineRule="auto"/>
+        <w:rPr>
+          <w:sz w:val="20"/>
+          <w:szCs w:val="20"/>
+        </w:rPr>
+      </w:pPr>
+    </w:p>
+    <w:p>
+      <w:pPr>
+        <w:spacing w:after="0" w:line="240" w:lineRule="auto"/>
+        <w:jc w:val="both"/>
+        <w:rPr>
+          <w:b/>
+          <w:bCs/>
+          <w:sz w:val="22"/>
+          <w:szCs w:val="22"/>
+        </w:rPr>
+      </w:pPr>
+      <w:r>
+        <w:rPr>
+          <w:b/>
+          <w:bCs/>
+          <w:sz w:val="22"/>
+          <w:szCs w:val="22"/>
+        </w:rPr>
+        <w:t>4.</w:t>
+      </w:r>
+      <w:r>
+        <w:rPr>
+          <w:b/>
+          <w:bCs/>
+          <w:sz w:val="22"/>
+          <w:szCs w:val="22"/>
+        </w:rPr>
+        <w:t xml:space="preserve"> Instrukcja obsługi</w:t>
+      </w:r>
+    </w:p>
+    <w:p>
+      <w:pPr>
+        <w:spacing w:after="0" w:line="360" w:lineRule="auto"/>
+        <w:jc w:val="both"/>
+        <w:rPr>
+          <w:b/>
+          <w:bCs/>
+          <w:sz w:val="22"/>
+          <w:szCs w:val="22"/>
+        </w:rPr>
+      </w:pPr>
+    </w:p>
+    <w:p>
+      <w:pPr>
+        <w:spacing w:after="0" w:line="240" w:lineRule="auto"/>
+        <w:jc w:val="both"/>
+        <w:rPr>
+          <w:b/>
+          <w:bCs/>
+          <w:sz w:val="22"/>
+          <w:szCs w:val="22"/>
+        </w:rPr>
+      </w:pPr>
+    </w:p>
+    <w:p>
+      <w:pPr>
+        <w:spacing w:after="0" w:line="360" w:lineRule="auto"/>
+        <w:jc w:val="both"/>
+        <w:rPr>
+          <w:b/>
+          <w:bCs/>
+          <w:sz w:val="22"/>
+          <w:szCs w:val="22"/>
+        </w:rPr>
+      </w:pPr>
+      <w:r>
+        <w:rPr>
+          <w:b/>
+          <w:bCs/>
+          <w:sz w:val="22"/>
+          <w:szCs w:val="22"/>
+        </w:rPr>
+        <w:t>5. Podział ról</w:t>
+      </w:r>
+    </w:p>
+    <w:p>
+      <w:pPr>
+        <w:spacing w:after="0" w:line="240" w:lineRule="auto"/>
+        <w:jc w:val="both"/>
+        <w:rPr>
+          <w:sz w:val="20"/>
+          <w:szCs w:val="20"/>
+        </w:rPr>
+      </w:pPr>
+      <w:r>
+        <w:rPr>
+          <w:sz w:val="20"/>
+          <w:szCs w:val="20"/>
+        </w:rPr>
+        <w:t xml:space="preserve">Dawid </w:t>
+      </w:r>
+      <w:proofErr w:type="spellStart"/>
+      <w:r>
+        <w:rPr>
+          <w:sz w:val="20"/>
+          <w:szCs w:val="20"/>
+        </w:rPr>
+        <w:t>Aleksiejuk</w:t>
+      </w:r>
+      <w:proofErr w:type="spellEnd"/>
+      <w:r>
+        <w:rPr>
+          <w:sz w:val="20"/>
+          <w:szCs w:val="20"/>
+        </w:rPr>
+        <w:t xml:space="preserve"> – logika zarządzania ligą, obsługa dynamicznych wektorów, algorytmy sortowania tabeli </w:t>
+      </w:r>
+      <w:r>
+        <w:rPr>
+          <w:sz w:val="20"/>
+          <w:szCs w:val="20"/>
+        </w:rPr>
+        <w:br/>
+        <w:t>i generowania terminarza (Liga)</w:t>
+      </w:r>
+    </w:p>
+    <w:p>
+      <w:pPr>
+        <w:spacing w:after="0" w:line="240" w:lineRule="auto"/>
+        <w:jc w:val="both"/>
+        <w:rPr>
+          <w:sz w:val="20"/>
+          <w:szCs w:val="20"/>
+        </w:rPr>
+      </w:pPr>
+    </w:p>
+    <w:p>
+      <w:pPr>
+        <w:spacing w:after="0" w:line="240" w:lineRule="auto"/>
+        <w:jc w:val="both"/>
+        <w:rPr>
+          <w:sz w:val="20"/>
+          <w:szCs w:val="20"/>
+        </w:rPr>
+      </w:pPr>
+      <w:r>
+        <w:rPr>
+          <w:sz w:val="20"/>
+          <w:szCs w:val="20"/>
+        </w:rPr>
+        <w:t xml:space="preserve">Jakub Hlebowicz – stworzenie interfejsu użytkownika, walidacja danych wejściowych, obsługa zapisu i </w:t>
+      </w:r>
+      <w:proofErr w:type="spellStart"/>
+      <w:r>
+        <w:rPr>
+          <w:sz w:val="20"/>
+          <w:szCs w:val="20"/>
+        </w:rPr>
+        <w:t>doczytu</w:t>
+      </w:r>
+      <w:proofErr w:type="spellEnd"/>
+      <w:r>
+        <w:rPr>
+          <w:sz w:val="20"/>
+          <w:szCs w:val="20"/>
+        </w:rPr>
+        <w:t xml:space="preserve"> danych z plików (Interface, Dane)</w:t>
+      </w:r>
+    </w:p>
+    <w:p>
+      <w:pPr>
+        <w:spacing w:after="0" w:line="240" w:lineRule="auto"/>
+        <w:jc w:val="both"/>
+        <w:rPr>
+          <w:sz w:val="20"/>
+          <w:szCs w:val="20"/>
+        </w:rPr>
+      </w:pPr>
+    </w:p>
+    <w:p>
+      <w:pPr>
+        <w:spacing w:after="0" w:line="240" w:lineRule="auto"/>
+        <w:jc w:val="both"/>
+        <w:rPr>
+          <w:sz w:val="20"/>
+          <w:szCs w:val="20"/>
+        </w:rPr>
+      </w:pPr>
+      <w:r>
+        <w:rPr>
+          <w:sz w:val="20"/>
+          <w:szCs w:val="20"/>
+        </w:rPr>
+        <w:t xml:space="preserve">Dawid </w:t>
+      </w:r>
+      <w:proofErr w:type="spellStart"/>
+      <w:r>
+        <w:rPr>
+          <w:sz w:val="20"/>
+          <w:szCs w:val="20"/>
+        </w:rPr>
+        <w:t>Treszczotko</w:t>
+      </w:r>
+      <w:proofErr w:type="spellEnd"/>
+      <w:r>
+        <w:rPr>
+          <w:sz w:val="20"/>
+          <w:szCs w:val="20"/>
+        </w:rPr>
+        <w:t xml:space="preserve"> – implementacja mechaniki spotkań, hermetyzacja danych drużyn, wdrażanie polimorfizmu i wyjątków wejściowych (</w:t>
+      </w:r>
+      <w:proofErr w:type="spellStart"/>
+      <w:r>
+        <w:rPr>
+          <w:sz w:val="20"/>
+          <w:szCs w:val="20"/>
+        </w:rPr>
+        <w:t>Druzyna</w:t>
+      </w:r>
+      <w:proofErr w:type="spellEnd"/>
+      <w:r>
+        <w:rPr>
+          <w:sz w:val="20"/>
+          <w:szCs w:val="20"/>
+        </w:rPr>
+        <w:t>, Mecz, Wydarzenie)</w:t>
+      </w:r>
+    </w:p>
+    <w:p>
+      <w:pPr>
+        <w:spacing w:after="0" w:line="276" w:lineRule="auto"/>
+        <w:ind w:left="0" w:firstLine="0"/>
+        <w:jc w:val="both"/>
+        <w:rPr>
+          <w:sz w:val="20"/>
+          <w:szCs w:val="20"/>
+        </w:rPr>
+      </w:pPr>
+    </w:p>
+    <w:p>
+      <w:pPr>
+        <w:spacing w:after="0" w:line="240" w:lineRule="auto"/>
+        <w:jc w:val="both"/>
+        <w:rPr>
+          <w:sz w:val="20"/>
+          <w:szCs w:val="20"/>
+        </w:rPr>
+      </w:pPr>
     </w:p>
     <w:sectPr>
       <w:pgSz w:w="11906" w:h="16838"/>
@@ -1129,7 +2132,7 @@
   <w:abstractNum w:abstractNumId="0" w15:restartNumberingAfterBreak="0">
     <w:nsid w:val="0959542A"/>
     <w:multiLevelType w:val="hybridMultilevel"/>
-    <w:tmpl w:val="388A5922"/>
+    <w:tmpl w:val="C18CD384"/>
     <w:lvl w:ilvl="0" w:tplc="04150001">
       <w:start w:val="1"/>
       <w:numFmt w:val="bullet"/>
@@ -2048,6 +3051,7 @@
       <w:numPr>
         <w:ilvl w:val="1"/>
       </w:numPr>
+      <w:ind w:left="148" w:hanging="10"/>
     </w:pPr>
     <w:rPr>
       <w:rFonts w:eastAsiaTheme="majorEastAsia" w:cstheme="majorBidi"/>

</xml_diff>

<commit_message>
Add final documentation and minor improvements
</commit_message>
<xml_diff>
--- a/Dokumentacja.docx
+++ b/Dokumentacja.docx
@@ -10,7 +10,7 @@
           <w:sz w:val="20"/>
         </w:rPr>
         <w:drawing>
-          <wp:anchor distT="0" distB="0" distL="114300" distR="114300" simplePos="0" relativeHeight="251658240" behindDoc="0" locked="0" layoutInCell="1" allowOverlap="1" wp14:anchorId="3A8B36FD" wp14:editId="0C7029AC">
+          <wp:anchor distT="0" distB="0" distL="114300" distR="114300" simplePos="0" relativeHeight="251658240" behindDoc="0" locked="0" layoutInCell="1" allowOverlap="1" wp14:anchorId="3A8B36FD" wp14:editId="77E6E16A">
             <wp:simplePos x="0" y="0"/>
             <wp:positionH relativeFrom="margin">
               <wp:align>center</wp:align>
@@ -388,7 +388,49 @@
           <w:sz w:val="20"/>
           <w:szCs w:val="20"/>
         </w:rPr>
-        <w:t>Nasz projekt to aplikacja konsolowa wykonana w języku c++ pozwalająca na zarządzanie rozgrywkami sportowymi opartymi na systemie ligowym. Program pozwala na zarządzanie ligą, dodawanie drużyn, rozgrywanie spotkań i śledzenie tabeli wyników z opcją importu i eksportu do pliku txt.</w:t>
+        <w:t>Nasz projekt to aplikacja konsolowa wykonana w języku c++ pozwalająca na zarządzanie rozgrywkami sportowymi opartymi na systemie ligowym. Program pozwala na zarządzanie ligą, dodawanie</w:t>
+      </w:r>
+      <w:r>
+        <w:rPr>
+          <w:sz w:val="20"/>
+          <w:szCs w:val="20"/>
+        </w:rPr>
+        <w:t xml:space="preserve"> i usuwanie</w:t>
+      </w:r>
+      <w:r>
+        <w:rPr>
+          <w:sz w:val="20"/>
+          <w:szCs w:val="20"/>
+        </w:rPr>
+        <w:t xml:space="preserve"> drużyn, rozgrywanie spotkań</w:t>
+      </w:r>
+      <w:r>
+        <w:rPr>
+          <w:sz w:val="20"/>
+          <w:szCs w:val="20"/>
+        </w:rPr>
+        <w:t>, generowanie czy wyświetlanie terminarza, a także</w:t>
+      </w:r>
+      <w:r>
+        <w:rPr>
+          <w:sz w:val="20"/>
+          <w:szCs w:val="20"/>
+        </w:rPr>
+        <w:t xml:space="preserve"> śledzenie tabeli wyników </w:t>
+      </w:r>
+      <w:r>
+        <w:rPr>
+          <w:sz w:val="20"/>
+          <w:szCs w:val="20"/>
+        </w:rPr>
+        <w:br/>
+      </w:r>
+      <w:r>
+        <w:rPr>
+          <w:sz w:val="20"/>
+          <w:szCs w:val="20"/>
+        </w:rPr>
+        <w:t>z opcją importu i eksportu do pliku txt.</w:t>
       </w:r>
     </w:p>
     <w:p>
@@ -455,25 +497,23 @@
       </w:pPr>
       <w:r>
         <w:rPr>
-          <w:sz w:val="20"/>
-          <w:szCs w:val="20"/>
-        </w:rPr>
-        <w:t xml:space="preserve">Definiowanie klas i obiektów: podział całej logiki programu na niezależne byty (abstrakcje pojęć ze świata rzeczywistego, takie jak </w:t>
-      </w:r>
-      <w:r>
-        <w:rPr>
-          <w:i/>
-          <w:iCs/>
-          <w:sz w:val="20"/>
-          <w:szCs w:val="20"/>
-        </w:rPr>
-        <w:t xml:space="preserve">Liga, </w:t>
+          <w:b/>
+          <w:bCs/>
+          <w:sz w:val="20"/>
+          <w:szCs w:val="20"/>
+        </w:rPr>
+        <w:t>Definiowanie klas:</w:t>
+      </w:r>
+      <w:r>
+        <w:rPr>
+          <w:sz w:val="20"/>
+          <w:szCs w:val="20"/>
+        </w:rPr>
+        <w:t xml:space="preserve"> Podział programu na współpracujące, logiczne byty ze swoimi stanami i metodami (np. Liga, </w:t>
       </w:r>
       <w:proofErr w:type="spellStart"/>
       <w:r>
         <w:rPr>
-          <w:i/>
-          <w:iCs/>
           <w:sz w:val="20"/>
           <w:szCs w:val="20"/>
         </w:rPr>
@@ -482,19 +522,10 @@
       <w:proofErr w:type="spellEnd"/>
       <w:r>
         <w:rPr>
-          <w:i/>
-          <w:iCs/>
-          <w:sz w:val="20"/>
-          <w:szCs w:val="20"/>
-        </w:rPr>
-        <w:t>, Mecz</w:t>
-      </w:r>
-      <w:r>
-        <w:rPr>
-          <w:sz w:val="20"/>
-          <w:szCs w:val="20"/>
-        </w:rPr>
-        <w:t>), które posiadają własne stany oraz metody, tworząc spójnie współpracujący system</w:t>
+          <w:sz w:val="20"/>
+          <w:szCs w:val="20"/>
+        </w:rPr>
+        <w:t>)</w:t>
       </w:r>
     </w:p>
     <w:p>
@@ -513,111 +544,52 @@
       </w:pPr>
       <w:r>
         <w:rPr>
-          <w:sz w:val="20"/>
-          <w:szCs w:val="20"/>
-        </w:rPr>
-        <w:t xml:space="preserve">Hermetyzacja: ukrycie kluczowych danych (np. zmiennych </w:t>
-      </w:r>
-      <w:r>
-        <w:rPr>
-          <w:i/>
-          <w:iCs/>
-          <w:sz w:val="20"/>
-          <w:szCs w:val="20"/>
-        </w:rPr>
-        <w:t>nazwa</w:t>
-      </w:r>
-      <w:r>
-        <w:rPr>
-          <w:sz w:val="20"/>
-          <w:szCs w:val="20"/>
-        </w:rPr>
-        <w:t xml:space="preserve"> czy </w:t>
-      </w:r>
-      <w:r>
-        <w:rPr>
-          <w:i/>
-          <w:iCs/>
-          <w:sz w:val="20"/>
-          <w:szCs w:val="20"/>
-        </w:rPr>
-        <w:t xml:space="preserve">punkty </w:t>
-      </w:r>
-      <w:r>
-        <w:rPr>
-          <w:sz w:val="20"/>
-          <w:szCs w:val="20"/>
-        </w:rPr>
-        <w:t xml:space="preserve">w klasie </w:t>
+          <w:b/>
+          <w:bCs/>
+          <w:sz w:val="20"/>
+          <w:szCs w:val="20"/>
+        </w:rPr>
+        <w:t>Hermetyzacja:</w:t>
+      </w:r>
+      <w:r>
+        <w:rPr>
+          <w:sz w:val="20"/>
+          <w:szCs w:val="20"/>
+        </w:rPr>
+        <w:t xml:space="preserve"> Ukrycie kluczowych danych w sekcji </w:t>
       </w:r>
       <w:proofErr w:type="spellStart"/>
       <w:r>
         <w:rPr>
-          <w:i/>
-          <w:iCs/>
+          <w:sz w:val="20"/>
+          <w:szCs w:val="20"/>
+        </w:rPr>
+        <w:t>private</w:t>
+      </w:r>
+      <w:proofErr w:type="spellEnd"/>
+      <w:r>
+        <w:rPr>
+          <w:sz w:val="20"/>
+          <w:szCs w:val="20"/>
+        </w:rPr>
+        <w:t xml:space="preserve"> i bezpieczny dostęp do nich wyłącznie przez odpowiednie gettery i </w:t>
+      </w:r>
+      <w:r>
+        <w:rPr>
+          <w:sz w:val="20"/>
+          <w:szCs w:val="20"/>
+        </w:rPr>
+        <w:t xml:space="preserve">setery np. w klasie </w:t>
+      </w:r>
+      <w:proofErr w:type="spellStart"/>
+      <w:r>
+        <w:rPr>
           <w:sz w:val="20"/>
           <w:szCs w:val="20"/>
         </w:rPr>
         <w:t>Druzyna</w:t>
       </w:r>
       <w:proofErr w:type="spellEnd"/>
-      <w:r>
-        <w:rPr>
-          <w:sz w:val="20"/>
-          <w:szCs w:val="20"/>
-        </w:rPr>
-        <w:t xml:space="preserve"> oraz wektorów w klasie </w:t>
-      </w:r>
-      <w:r>
-        <w:rPr>
-          <w:i/>
-          <w:iCs/>
-          <w:sz w:val="20"/>
-          <w:szCs w:val="20"/>
-        </w:rPr>
-        <w:t>Liga</w:t>
-      </w:r>
-      <w:r>
-        <w:rPr>
-          <w:sz w:val="20"/>
-          <w:szCs w:val="20"/>
-        </w:rPr>
-        <w:t xml:space="preserve">) w sekcji </w:t>
-      </w:r>
-      <w:proofErr w:type="spellStart"/>
-      <w:r>
-        <w:rPr>
-          <w:i/>
-          <w:iCs/>
-          <w:sz w:val="20"/>
-          <w:szCs w:val="20"/>
-        </w:rPr>
-        <w:t>private</w:t>
-      </w:r>
-      <w:proofErr w:type="spellEnd"/>
-      <w:r>
-        <w:rPr>
-          <w:sz w:val="20"/>
-          <w:szCs w:val="20"/>
-        </w:rPr>
-        <w:t xml:space="preserve"> i kontrolowanie do nich dostępu wyłącznie za pomocą publicznych metod dostępowych (getterów i </w:t>
-      </w:r>
-      <w:proofErr w:type="spellStart"/>
-      <w:r>
-        <w:rPr>
-          <w:sz w:val="20"/>
-          <w:szCs w:val="20"/>
-        </w:rPr>
-        <w:t>setterów</w:t>
-      </w:r>
-      <w:proofErr w:type="spellEnd"/>
-      <w:r>
-        <w:rPr>
-          <w:sz w:val="20"/>
-          <w:szCs w:val="20"/>
-        </w:rPr>
-        <w:t>), co chroni stan obiektów przed niepowołaną modyfikacją z zewnątrz</w:t>
-      </w:r>
     </w:p>
     <w:p>
       <w:pPr>
@@ -629,64 +601,25 @@
         <w:spacing w:after="0" w:line="276" w:lineRule="auto"/>
         <w:jc w:val="both"/>
         <w:rPr>
-          <w:b/>
-          <w:bCs/>
-          <w:sz w:val="22"/>
-          <w:szCs w:val="22"/>
-        </w:rPr>
-      </w:pPr>
-      <w:r>
-        <w:rPr>
-          <w:sz w:val="20"/>
-          <w:szCs w:val="20"/>
-        </w:rPr>
-        <w:t xml:space="preserve">Dziedziczenie: klasa </w:t>
-      </w:r>
-      <w:r>
-        <w:rPr>
-          <w:i/>
-          <w:iCs/>
-          <w:sz w:val="20"/>
-          <w:szCs w:val="20"/>
-        </w:rPr>
-        <w:t>Mecz</w:t>
-      </w:r>
-      <w:r>
-        <w:rPr>
-          <w:sz w:val="20"/>
-          <w:szCs w:val="20"/>
-        </w:rPr>
-        <w:t xml:space="preserve"> dziedziczy po abstrakcyjnej klasie bazowej </w:t>
-      </w:r>
-      <w:r>
-        <w:rPr>
-          <w:i/>
-          <w:iCs/>
-          <w:sz w:val="20"/>
-          <w:szCs w:val="20"/>
-        </w:rPr>
-        <w:t>Wydarzenie,</w:t>
-      </w:r>
-      <w:r>
-        <w:rPr>
-          <w:sz w:val="20"/>
-          <w:szCs w:val="20"/>
-        </w:rPr>
-        <w:t xml:space="preserve"> przejmując jej cechy (np. datę</w:t>
-      </w:r>
-      <w:r>
-        <w:rPr>
-          <w:sz w:val="20"/>
-          <w:szCs w:val="20"/>
-        </w:rPr>
-        <w:t xml:space="preserve"> wydarzenia</w:t>
-      </w:r>
-      <w:r>
-        <w:rPr>
-          <w:sz w:val="20"/>
-          <w:szCs w:val="20"/>
-        </w:rPr>
-        <w:t>)</w:t>
+          <w:sz w:val="20"/>
+          <w:szCs w:val="20"/>
+        </w:rPr>
+      </w:pPr>
+      <w:r>
+        <w:rPr>
+          <w:b/>
+          <w:bCs/>
+          <w:sz w:val="20"/>
+          <w:szCs w:val="20"/>
+        </w:rPr>
+        <w:t>Dziedziczenie:</w:t>
+      </w:r>
+      <w:r>
+        <w:rPr>
+          <w:sz w:val="20"/>
+          <w:szCs w:val="20"/>
+        </w:rPr>
+        <w:t xml:space="preserve"> Klasa Mecz przejmuje cechy i zachowania (np. datę) po abstrakcyjnej klasie bazowej Wydarzenie</w:t>
       </w:r>
     </w:p>
     <w:p>
@@ -699,40 +632,45 @@
         <w:spacing w:after="0" w:line="276" w:lineRule="auto"/>
         <w:jc w:val="both"/>
         <w:rPr>
-          <w:b/>
-          <w:bCs/>
-          <w:sz w:val="22"/>
-          <w:szCs w:val="22"/>
-        </w:rPr>
-      </w:pPr>
-      <w:r>
-        <w:rPr>
-          <w:sz w:val="20"/>
-          <w:szCs w:val="20"/>
-        </w:rPr>
-        <w:t xml:space="preserve">Polimorfizm: metody wirtualne jak np. </w:t>
-      </w:r>
-      <w:r>
-        <w:rPr>
-          <w:i/>
-          <w:iCs/>
-          <w:sz w:val="20"/>
-          <w:szCs w:val="20"/>
-        </w:rPr>
-        <w:t>rozegraj()</w:t>
-      </w:r>
-      <w:r>
-        <w:rPr>
-          <w:sz w:val="20"/>
-          <w:szCs w:val="20"/>
-        </w:rPr>
-        <w:t xml:space="preserve"> czy </w:t>
+          <w:sz w:val="20"/>
+          <w:szCs w:val="20"/>
+        </w:rPr>
+      </w:pPr>
+      <w:r>
+        <w:rPr>
+          <w:b/>
+          <w:bCs/>
+          <w:sz w:val="20"/>
+          <w:szCs w:val="20"/>
+        </w:rPr>
+        <w:t>Polimorfizm:</w:t>
+      </w:r>
+      <w:r>
+        <w:rPr>
+          <w:sz w:val="20"/>
+          <w:szCs w:val="20"/>
+        </w:rPr>
+        <w:t xml:space="preserve"> Mechanizm nadpisywania (</w:t>
       </w:r>
       <w:proofErr w:type="spellStart"/>
       <w:r>
         <w:rPr>
-          <w:i/>
-          <w:iCs/>
+          <w:sz w:val="20"/>
+          <w:szCs w:val="20"/>
+        </w:rPr>
+        <w:t>override</w:t>
+      </w:r>
+      <w:proofErr w:type="spellEnd"/>
+      <w:r>
+        <w:rPr>
+          <w:sz w:val="20"/>
+          <w:szCs w:val="20"/>
+        </w:rPr>
+        <w:t xml:space="preserve">) metod wirtualnych, takich jak rozegraj() czy </w:t>
+      </w:r>
+      <w:proofErr w:type="spellStart"/>
+      <w:r>
+        <w:rPr>
           <w:sz w:val="20"/>
           <w:szCs w:val="20"/>
         </w:rPr>
@@ -741,19 +679,10 @@
       <w:proofErr w:type="spellEnd"/>
       <w:r>
         <w:rPr>
-          <w:i/>
-          <w:iCs/>
           <w:sz w:val="20"/>
           <w:szCs w:val="20"/>
         </w:rPr>
         <w:t>()</w:t>
-      </w:r>
-      <w:r>
-        <w:rPr>
-          <w:sz w:val="20"/>
-          <w:szCs w:val="20"/>
-        </w:rPr>
-        <w:t xml:space="preserve"> nadpisane w klasie pochodnej</w:t>
       </w:r>
     </w:p>
     <w:p>
@@ -766,43 +695,25 @@
         <w:spacing w:after="0" w:line="276" w:lineRule="auto"/>
         <w:jc w:val="both"/>
         <w:rPr>
-          <w:b/>
-          <w:bCs/>
-          <w:sz w:val="22"/>
-          <w:szCs w:val="22"/>
-        </w:rPr>
-      </w:pPr>
-      <w:r>
-        <w:rPr>
-          <w:sz w:val="20"/>
-          <w:szCs w:val="20"/>
-        </w:rPr>
-        <w:t xml:space="preserve">Kompozycja: klasa Interface ma silny związek ze swoimi wewnętrznymi obiektami </w:t>
-      </w:r>
-      <w:r>
-        <w:rPr>
-          <w:i/>
-          <w:iCs/>
-          <w:sz w:val="20"/>
-          <w:szCs w:val="20"/>
-        </w:rPr>
-        <w:t>Liga</w:t>
-      </w:r>
-      <w:r>
-        <w:rPr>
-          <w:sz w:val="20"/>
-          <w:szCs w:val="20"/>
-        </w:rPr>
-        <w:t xml:space="preserve"> oraz </w:t>
-      </w:r>
-      <w:r>
-        <w:rPr>
-          <w:i/>
-          <w:iCs/>
-          <w:sz w:val="20"/>
-          <w:szCs w:val="20"/>
-        </w:rPr>
-        <w:t>Dane</w:t>
+          <w:sz w:val="20"/>
+          <w:szCs w:val="20"/>
+        </w:rPr>
+      </w:pPr>
+      <w:r>
+        <w:rPr>
+          <w:b/>
+          <w:bCs/>
+          <w:sz w:val="20"/>
+          <w:szCs w:val="20"/>
+        </w:rPr>
+        <w:t>Kompozycja:</w:t>
+      </w:r>
+      <w:r>
+        <w:rPr>
+          <w:sz w:val="20"/>
+          <w:szCs w:val="20"/>
+        </w:rPr>
+        <w:t xml:space="preserve"> Silny związek, w którym Interface na stałe powołuje do życia i zarządza obiektami Liga oraz Dane</w:t>
       </w:r>
     </w:p>
     <w:p>
@@ -815,87 +726,39 @@
         <w:spacing w:after="0" w:line="276" w:lineRule="auto"/>
         <w:jc w:val="both"/>
         <w:rPr>
-          <w:b/>
-          <w:bCs/>
-          <w:sz w:val="22"/>
-          <w:szCs w:val="22"/>
-        </w:rPr>
-      </w:pPr>
-      <w:r>
-        <w:rPr>
-          <w:sz w:val="20"/>
-          <w:szCs w:val="20"/>
-        </w:rPr>
-        <w:t xml:space="preserve">Agregacja: </w:t>
-      </w:r>
-      <w:r>
-        <w:rPr>
-          <w:sz w:val="20"/>
-          <w:szCs w:val="20"/>
-        </w:rPr>
-        <w:t>k</w:t>
-      </w:r>
-      <w:r>
-        <w:rPr>
-          <w:sz w:val="20"/>
-          <w:szCs w:val="20"/>
-        </w:rPr>
-        <w:t>lasa</w:t>
-      </w:r>
-      <w:r>
-        <w:rPr>
-          <w:i/>
-          <w:iCs/>
-          <w:sz w:val="20"/>
-          <w:szCs w:val="20"/>
-        </w:rPr>
-        <w:t xml:space="preserve"> Mecz </w:t>
-      </w:r>
-      <w:r>
-        <w:rPr>
-          <w:sz w:val="20"/>
-          <w:szCs w:val="20"/>
-        </w:rPr>
-        <w:t xml:space="preserve">poprzez luźny związek z </w:t>
-      </w:r>
-      <w:r>
-        <w:rPr>
-          <w:sz w:val="20"/>
-          <w:szCs w:val="20"/>
-        </w:rPr>
-        <w:t>danymi ligowymi</w:t>
-      </w:r>
-      <w:r>
-        <w:rPr>
-          <w:i/>
-          <w:iCs/>
-          <w:sz w:val="20"/>
-          <w:szCs w:val="20"/>
-        </w:rPr>
-        <w:t xml:space="preserve"> </w:t>
-      </w:r>
-      <w:r>
-        <w:rPr>
-          <w:sz w:val="20"/>
-          <w:szCs w:val="20"/>
-        </w:rPr>
-        <w:t>przechowuje jedynie wskaźniki (</w:t>
-      </w:r>
-      <w:r>
-        <w:rPr>
-          <w:i/>
-          <w:iCs/>
-          <w:sz w:val="20"/>
-          <w:szCs w:val="20"/>
-        </w:rPr>
-        <w:t>*gospodarz, *gość</w:t>
-      </w:r>
-      <w:r>
-        <w:rPr>
-          <w:sz w:val="20"/>
-          <w:szCs w:val="20"/>
-        </w:rPr>
-        <w:t>) na niezależnie istniejące obiekty w wektorze ligi</w:t>
+          <w:sz w:val="20"/>
+          <w:szCs w:val="20"/>
+        </w:rPr>
+      </w:pPr>
+      <w:r>
+        <w:rPr>
+          <w:b/>
+          <w:bCs/>
+          <w:sz w:val="20"/>
+          <w:szCs w:val="20"/>
+        </w:rPr>
+        <w:t>Agregacja:</w:t>
+      </w:r>
+      <w:r>
+        <w:rPr>
+          <w:sz w:val="20"/>
+          <w:szCs w:val="20"/>
+        </w:rPr>
+        <w:t xml:space="preserve"> Klasa Mecz przechowuje jedynie wskaźniki na drużyny, które fizycznie </w:t>
+      </w:r>
+      <w:r>
+        <w:rPr>
+          <w:sz w:val="20"/>
+          <w:szCs w:val="20"/>
+        </w:rPr>
+        <w:t>f</w:t>
+      </w:r>
+      <w:r>
+        <w:rPr>
+          <w:sz w:val="20"/>
+          <w:szCs w:val="20"/>
+        </w:rPr>
+        <w:t>unkcjonują niezależnie wewnątrz ligi</w:t>
       </w:r>
     </w:p>
     <w:p>
@@ -914,16 +777,23 @@
       </w:pPr>
       <w:r>
         <w:rPr>
-          <w:sz w:val="20"/>
-          <w:szCs w:val="20"/>
-        </w:rPr>
-        <w:t xml:space="preserve">Typy generyczne: wykorzystanie szablonów (kontenerów z biblioteki standardowej STL), takich jak </w:t>
+          <w:b/>
+          <w:bCs/>
+          <w:sz w:val="20"/>
+          <w:szCs w:val="20"/>
+        </w:rPr>
+        <w:t>Typy generyczne:</w:t>
+      </w:r>
+      <w:r>
+        <w:rPr>
+          <w:sz w:val="20"/>
+          <w:szCs w:val="20"/>
+        </w:rPr>
+        <w:t xml:space="preserve"> Zastosowanie elastycznych kontenerów </w:t>
       </w:r>
       <w:proofErr w:type="spellStart"/>
       <w:r>
         <w:rPr>
-          <w:i/>
-          <w:iCs/>
           <w:sz w:val="20"/>
           <w:szCs w:val="20"/>
         </w:rPr>
@@ -932,8 +802,6 @@
       <w:proofErr w:type="spellEnd"/>
       <w:r>
         <w:rPr>
-          <w:i/>
-          <w:iCs/>
           <w:sz w:val="20"/>
           <w:szCs w:val="20"/>
         </w:rPr>
@@ -942,8 +810,6 @@
       <w:proofErr w:type="spellStart"/>
       <w:r>
         <w:rPr>
-          <w:i/>
-          <w:iCs/>
           <w:sz w:val="20"/>
           <w:szCs w:val="20"/>
         </w:rPr>
@@ -952,86 +818,17 @@
       <w:proofErr w:type="spellEnd"/>
       <w:r>
         <w:rPr>
-          <w:i/>
-          <w:iCs/>
-          <w:sz w:val="20"/>
-          <w:szCs w:val="20"/>
-        </w:rPr>
-        <w:t>&lt;</w:t>
-      </w:r>
-      <w:proofErr w:type="spellStart"/>
-      <w:r>
-        <w:rPr>
-          <w:i/>
-          <w:iCs/>
-          <w:sz w:val="20"/>
-          <w:szCs w:val="20"/>
-        </w:rPr>
-        <w:t>Druzyna</w:t>
-      </w:r>
-      <w:proofErr w:type="spellEnd"/>
-      <w:r>
-        <w:rPr>
-          <w:i/>
-          <w:iCs/>
-          <w:sz w:val="20"/>
-          <w:szCs w:val="20"/>
-        </w:rPr>
-        <w:t>&gt;</w:t>
-      </w:r>
-      <w:r>
-        <w:rPr>
-          <w:sz w:val="20"/>
-          <w:szCs w:val="20"/>
-        </w:rPr>
-        <w:t xml:space="preserve"> czy </w:t>
-      </w:r>
-      <w:proofErr w:type="spellStart"/>
-      <w:r>
-        <w:rPr>
-          <w:i/>
-          <w:iCs/>
-          <w:sz w:val="20"/>
-          <w:szCs w:val="20"/>
-        </w:rPr>
-        <w:t>std</w:t>
-      </w:r>
-      <w:proofErr w:type="spellEnd"/>
-      <w:r>
-        <w:rPr>
-          <w:i/>
-          <w:iCs/>
-          <w:sz w:val="20"/>
-          <w:szCs w:val="20"/>
-        </w:rPr>
-        <w:t>::</w:t>
-      </w:r>
-      <w:proofErr w:type="spellStart"/>
-      <w:r>
-        <w:rPr>
-          <w:i/>
-          <w:iCs/>
-          <w:sz w:val="20"/>
-          <w:szCs w:val="20"/>
-        </w:rPr>
-        <w:t>vector</w:t>
-      </w:r>
-      <w:proofErr w:type="spellEnd"/>
-      <w:r>
-        <w:rPr>
-          <w:i/>
-          <w:iCs/>
-          <w:sz w:val="20"/>
-          <w:szCs w:val="20"/>
-        </w:rPr>
-        <w:t>&lt;Mecz&gt;,</w:t>
-      </w:r>
-      <w:r>
-        <w:rPr>
-          <w:sz w:val="20"/>
-          <w:szCs w:val="20"/>
-        </w:rPr>
-        <w:t xml:space="preserve"> pozwalających na elastyczne i w pełni bezpieczne typologicznie przechowywanie dynamicznych list obiektów</w:t>
+          <w:sz w:val="20"/>
+          <w:szCs w:val="20"/>
+        </w:rPr>
+        <w:t xml:space="preserve"> do bezpiecznego zarządzania dynamicznymi listami obiektów</w:t>
+      </w:r>
+      <w:r>
+        <w:rPr>
+          <w:sz w:val="20"/>
+          <w:szCs w:val="20"/>
+        </w:rPr>
+        <w:t xml:space="preserve"> (Liga)</w:t>
       </w:r>
     </w:p>
     <w:p>
@@ -1044,165 +841,101 @@
         <w:spacing w:after="0" w:line="276" w:lineRule="auto"/>
         <w:jc w:val="both"/>
         <w:rPr>
+          <w:sz w:val="20"/>
+          <w:szCs w:val="20"/>
+        </w:rPr>
+      </w:pPr>
+      <w:r>
+        <w:rPr>
+          <w:b/>
+          <w:bCs/>
+          <w:sz w:val="20"/>
+          <w:szCs w:val="20"/>
+        </w:rPr>
+        <w:t>Obsługa wyjątków:</w:t>
+      </w:r>
+      <w:r>
+        <w:rPr>
+          <w:sz w:val="20"/>
+          <w:szCs w:val="20"/>
+        </w:rPr>
+        <w:t xml:space="preserve"> Aktywne </w:t>
+      </w:r>
+      <w:r>
+        <w:rPr>
+          <w:sz w:val="20"/>
+          <w:szCs w:val="20"/>
+        </w:rPr>
+        <w:t>obsługiwanie</w:t>
+      </w:r>
+      <w:r>
+        <w:rPr>
+          <w:sz w:val="20"/>
+          <w:szCs w:val="20"/>
+        </w:rPr>
+        <w:t xml:space="preserve"> błędów (</w:t>
+      </w:r>
+      <w:proofErr w:type="spellStart"/>
+      <w:r>
+        <w:rPr>
+          <w:sz w:val="20"/>
+          <w:szCs w:val="20"/>
+        </w:rPr>
+        <w:t>invalid_argument</w:t>
+      </w:r>
+      <w:proofErr w:type="spellEnd"/>
+      <w:r>
+        <w:rPr>
+          <w:sz w:val="20"/>
+          <w:szCs w:val="20"/>
+        </w:rPr>
+        <w:t xml:space="preserve">, </w:t>
+      </w:r>
+      <w:proofErr w:type="spellStart"/>
+      <w:r>
+        <w:rPr>
+          <w:sz w:val="20"/>
+          <w:szCs w:val="20"/>
+        </w:rPr>
+        <w:t>runtime_error</w:t>
+      </w:r>
+      <w:proofErr w:type="spellEnd"/>
+      <w:r>
+        <w:rPr>
+          <w:sz w:val="20"/>
+          <w:szCs w:val="20"/>
+        </w:rPr>
+        <w:t>) blokujące działanie przy pustych nazwach, ujemnych bramkach czy braku pliku</w:t>
+      </w:r>
+      <w:r>
+        <w:rPr>
+          <w:sz w:val="20"/>
+          <w:szCs w:val="20"/>
+        </w:rPr>
+        <w:t xml:space="preserve"> (pliki Interface + Dane)</w:t>
+      </w:r>
+    </w:p>
+    <w:p>
+      <w:pPr>
+        <w:spacing w:after="0" w:line="276" w:lineRule="auto"/>
+        <w:jc w:val="both"/>
+        <w:rPr>
+          <w:b/>
+          <w:bCs/>
+        </w:rPr>
+      </w:pPr>
+    </w:p>
+    <w:p>
+      <w:pPr>
+        <w:spacing w:after="0" w:line="360" w:lineRule="auto"/>
+        <w:jc w:val="both"/>
+        <w:rPr>
           <w:b/>
           <w:bCs/>
           <w:sz w:val="22"/>
           <w:szCs w:val="22"/>
         </w:rPr>
       </w:pPr>
-      <w:r>
-        <w:rPr>
-          <w:sz w:val="20"/>
-          <w:szCs w:val="20"/>
-        </w:rPr>
-        <w:t xml:space="preserve">Obsługa wyjątków: zabezpieczenia w klasie </w:t>
-      </w:r>
-      <w:proofErr w:type="spellStart"/>
-      <w:r>
-        <w:rPr>
-          <w:i/>
-          <w:iCs/>
-          <w:sz w:val="20"/>
-          <w:szCs w:val="20"/>
-        </w:rPr>
-        <w:t>Druzyna</w:t>
-      </w:r>
-      <w:proofErr w:type="spellEnd"/>
-      <w:r>
-        <w:rPr>
-          <w:sz w:val="20"/>
-          <w:szCs w:val="20"/>
-        </w:rPr>
-        <w:t xml:space="preserve"> i </w:t>
-      </w:r>
-      <w:r>
-        <w:rPr>
-          <w:i/>
-          <w:iCs/>
-          <w:sz w:val="20"/>
-          <w:szCs w:val="20"/>
-        </w:rPr>
-        <w:t>Dane</w:t>
-      </w:r>
-      <w:r>
-        <w:rPr>
-          <w:i/>
-          <w:iCs/>
-          <w:sz w:val="20"/>
-          <w:szCs w:val="20"/>
-        </w:rPr>
-        <w:t xml:space="preserve"> </w:t>
-      </w:r>
-      <w:r>
-        <w:rPr>
-          <w:sz w:val="20"/>
-          <w:szCs w:val="20"/>
-        </w:rPr>
-        <w:t>rzucające wyjątki</w:t>
-      </w:r>
-      <w:r>
-        <w:rPr>
-          <w:sz w:val="20"/>
-          <w:szCs w:val="20"/>
-        </w:rPr>
-        <w:t>,</w:t>
-      </w:r>
-      <w:r>
-        <w:rPr>
-          <w:sz w:val="20"/>
-          <w:szCs w:val="20"/>
-        </w:rPr>
-        <w:t xml:space="preserve"> </w:t>
-      </w:r>
-      <w:r>
-        <w:rPr>
-          <w:sz w:val="20"/>
-          <w:szCs w:val="20"/>
-        </w:rPr>
-        <w:t>jak</w:t>
-      </w:r>
-      <w:r>
-        <w:rPr>
-          <w:i/>
-          <w:iCs/>
-          <w:sz w:val="20"/>
-          <w:szCs w:val="20"/>
-        </w:rPr>
-        <w:t xml:space="preserve"> </w:t>
-      </w:r>
-      <w:proofErr w:type="spellStart"/>
-      <w:r>
-        <w:rPr>
-          <w:i/>
-          <w:iCs/>
-          <w:sz w:val="20"/>
-          <w:szCs w:val="20"/>
-        </w:rPr>
-        <w:t>invalid_argument</w:t>
-      </w:r>
-      <w:proofErr w:type="spellEnd"/>
-      <w:r>
-        <w:rPr>
-          <w:i/>
-          <w:iCs/>
-          <w:sz w:val="20"/>
-          <w:szCs w:val="20"/>
-        </w:rPr>
-        <w:t xml:space="preserve"> </w:t>
-      </w:r>
-      <w:r>
-        <w:rPr>
-          <w:sz w:val="20"/>
-          <w:szCs w:val="20"/>
-        </w:rPr>
-        <w:t>czy</w:t>
-      </w:r>
-      <w:r>
-        <w:rPr>
-          <w:i/>
-          <w:iCs/>
-          <w:sz w:val="20"/>
-          <w:szCs w:val="20"/>
-        </w:rPr>
-        <w:t xml:space="preserve"> </w:t>
-      </w:r>
-      <w:proofErr w:type="spellStart"/>
-      <w:r>
-        <w:rPr>
-          <w:i/>
-          <w:iCs/>
-          <w:sz w:val="20"/>
-          <w:szCs w:val="20"/>
-        </w:rPr>
-        <w:t>runtime_error</w:t>
-      </w:r>
-      <w:proofErr w:type="spellEnd"/>
-      <w:r>
-        <w:rPr>
-          <w:i/>
-          <w:iCs/>
-          <w:sz w:val="20"/>
-          <w:szCs w:val="20"/>
-        </w:rPr>
-        <w:t xml:space="preserve"> </w:t>
-      </w:r>
-      <w:r>
-        <w:rPr>
-          <w:sz w:val="20"/>
-          <w:szCs w:val="20"/>
-        </w:rPr>
-        <w:t>przy błędnych danych wejściowych lub braku pliku</w:t>
-      </w:r>
-    </w:p>
-    <w:p>
-      <w:pPr>
-        <w:spacing w:after="0" w:line="360" w:lineRule="auto"/>
-        <w:jc w:val="both"/>
-        <w:rPr>
-          <w:b/>
-          <w:bCs/>
-        </w:rPr>
-      </w:pPr>
     </w:p>
     <w:p>
       <w:pPr>
@@ -1219,6 +952,7 @@
     <w:p>
       <w:pPr>
         <w:spacing w:after="0" w:line="360" w:lineRule="auto"/>
+        <w:ind w:left="0" w:firstLine="0"/>
         <w:jc w:val="both"/>
         <w:rPr>
           <w:b/>
@@ -1227,19 +961,6 @@
           <w:szCs w:val="22"/>
         </w:rPr>
       </w:pPr>
-    </w:p>
-    <w:p>
-      <w:pPr>
-        <w:spacing w:after="0" w:line="360" w:lineRule="auto"/>
-        <w:ind w:left="0" w:firstLine="0"/>
-        <w:jc w:val="both"/>
-        <w:rPr>
-          <w:b/>
-          <w:bCs/>
-          <w:sz w:val="22"/>
-          <w:szCs w:val="22"/>
-        </w:rPr>
-      </w:pPr>
       <w:r>
         <w:rPr>
           <w:i/>
@@ -1248,6 +969,7 @@
           <w:sz w:val="20"/>
           <w:szCs w:val="20"/>
         </w:rPr>
+        <w:lastRenderedPageBreak/>
         <w:drawing>
           <wp:anchor distT="0" distB="0" distL="114300" distR="114300" simplePos="0" relativeHeight="251659264" behindDoc="0" locked="0" layoutInCell="1" allowOverlap="1" wp14:anchorId="28948B8E" wp14:editId="44545F5E">
             <wp:simplePos x="0" y="0"/>
@@ -1880,7 +1602,7 @@
     </w:p>
     <w:p>
       <w:pPr>
-        <w:spacing w:after="0" w:line="240" w:lineRule="auto"/>
+        <w:spacing w:after="0" w:line="360" w:lineRule="auto"/>
         <w:jc w:val="both"/>
         <w:rPr>
           <w:b/>
@@ -1896,6 +1618,7 @@
           <w:sz w:val="22"/>
           <w:szCs w:val="22"/>
         </w:rPr>
+        <w:lastRenderedPageBreak/>
         <w:t>4.</w:t>
       </w:r>
       <w:r>
@@ -1905,51 +1628,1620 @@
           <w:sz w:val="22"/>
           <w:szCs w:val="22"/>
         </w:rPr>
-        <w:t xml:space="preserve"> Instrukcja obsługi</w:t>
-      </w:r>
-    </w:p>
-    <w:p>
-      <w:pPr>
-        <w:spacing w:after="0" w:line="360" w:lineRule="auto"/>
-        <w:jc w:val="both"/>
+        <w:t xml:space="preserve"> Instrukcja </w:t>
+      </w:r>
+      <w:r>
         <w:rPr>
           <w:b/>
           <w:bCs/>
           <w:sz w:val="22"/>
           <w:szCs w:val="22"/>
         </w:rPr>
-      </w:pPr>
-    </w:p>
-    <w:p>
-      <w:pPr>
-        <w:spacing w:after="0" w:line="240" w:lineRule="auto"/>
-        <w:jc w:val="both"/>
+        <w:t>uruchomienia i użycia</w:t>
+      </w:r>
+    </w:p>
+    <w:p>
+      <w:pPr>
+        <w:spacing w:after="0" w:line="240" w:lineRule="auto"/>
+        <w:jc w:val="both"/>
+        <w:rPr>
+          <w:b/>
+          <w:bCs/>
+          <w:sz w:val="20"/>
+          <w:szCs w:val="20"/>
+        </w:rPr>
+      </w:pPr>
+      <w:r>
         <w:rPr>
           <w:b/>
           <w:bCs/>
           <w:sz w:val="22"/>
           <w:szCs w:val="22"/>
         </w:rPr>
-      </w:pPr>
-    </w:p>
-    <w:p>
-      <w:pPr>
-        <w:spacing w:after="0" w:line="360" w:lineRule="auto"/>
-        <w:jc w:val="both"/>
+        <w:tab/>
+      </w:r>
+      <w:r>
         <w:rPr>
           <w:b/>
           <w:bCs/>
           <w:sz w:val="22"/>
           <w:szCs w:val="22"/>
         </w:rPr>
-      </w:pPr>
-      <w:r>
-        <w:rPr>
-          <w:b/>
-          <w:bCs/>
+        <w:tab/>
+      </w:r>
+      <w:r>
+        <w:rPr>
+          <w:b/>
+          <w:bCs/>
+          <w:sz w:val="20"/>
+          <w:szCs w:val="20"/>
+        </w:rPr>
+        <w:t>Uruchomienie programu</w:t>
+      </w:r>
+    </w:p>
+    <w:p>
+      <w:pPr>
+        <w:spacing w:after="0" w:line="240" w:lineRule="auto"/>
+        <w:jc w:val="both"/>
+        <w:rPr>
+          <w:b/>
+          <w:bCs/>
+          <w:sz w:val="20"/>
+          <w:szCs w:val="20"/>
+        </w:rPr>
+      </w:pPr>
+      <w:r>
+        <w:rPr>
+          <w:sz w:val="20"/>
+          <w:szCs w:val="20"/>
+        </w:rPr>
+        <w:t xml:space="preserve">Aby uruchomić projekt napisany w języku C++ należy najpierw skompilować wszystkie pliki źródłowe (poprzez komendę </w:t>
+      </w:r>
+      <w:r>
+        <w:rPr>
+          <w:b/>
+          <w:bCs/>
+          <w:sz w:val="20"/>
+          <w:szCs w:val="20"/>
+        </w:rPr>
+        <w:t>g++ *.</w:t>
+      </w:r>
+      <w:proofErr w:type="spellStart"/>
+      <w:r>
+        <w:rPr>
+          <w:b/>
+          <w:bCs/>
+          <w:sz w:val="20"/>
+          <w:szCs w:val="20"/>
+        </w:rPr>
+        <w:t>cpp</w:t>
+      </w:r>
+      <w:proofErr w:type="spellEnd"/>
+      <w:r>
+        <w:rPr>
+          <w:b/>
+          <w:bCs/>
+          <w:sz w:val="20"/>
+          <w:szCs w:val="20"/>
+        </w:rPr>
+        <w:t xml:space="preserve"> -o </w:t>
+      </w:r>
+      <w:proofErr w:type="spellStart"/>
+      <w:r>
+        <w:rPr>
+          <w:b/>
+          <w:bCs/>
+          <w:sz w:val="20"/>
+          <w:szCs w:val="20"/>
+        </w:rPr>
+        <w:t>main</w:t>
+      </w:r>
+      <w:proofErr w:type="spellEnd"/>
+      <w:r>
+        <w:rPr>
+          <w:sz w:val="20"/>
+          <w:szCs w:val="20"/>
+        </w:rPr>
+        <w:t xml:space="preserve">), a następnie uruchomić plik wykonywalny main.exe poprzez </w:t>
+      </w:r>
+      <w:r>
+        <w:rPr>
+          <w:b/>
+          <w:bCs/>
+          <w:sz w:val="20"/>
+          <w:szCs w:val="20"/>
+        </w:rPr>
+        <w:t>./main.exe</w:t>
+      </w:r>
+    </w:p>
+    <w:p>
+      <w:pPr>
+        <w:spacing w:after="0" w:line="240" w:lineRule="auto"/>
+        <w:jc w:val="both"/>
+        <w:rPr>
+          <w:b/>
+          <w:bCs/>
+          <w:sz w:val="20"/>
+          <w:szCs w:val="20"/>
+        </w:rPr>
+      </w:pPr>
+    </w:p>
+    <w:p>
+      <w:pPr>
+        <w:spacing w:after="0" w:line="276" w:lineRule="auto"/>
+        <w:jc w:val="both"/>
+        <w:rPr>
+          <w:b/>
+          <w:bCs/>
+          <w:sz w:val="20"/>
+          <w:szCs w:val="20"/>
+        </w:rPr>
+      </w:pPr>
+      <w:r>
+        <w:rPr>
+          <w:sz w:val="20"/>
+          <w:szCs w:val="20"/>
+        </w:rPr>
+        <w:tab/>
+      </w:r>
+      <w:r>
+        <w:rPr>
+          <w:sz w:val="20"/>
+          <w:szCs w:val="20"/>
+        </w:rPr>
+        <w:tab/>
+      </w:r>
+      <w:r>
+        <w:rPr>
+          <w:b/>
+          <w:bCs/>
+          <w:sz w:val="20"/>
+          <w:szCs w:val="20"/>
+        </w:rPr>
+        <w:t>Schemat poprawnego użycia:</w:t>
+      </w:r>
+    </w:p>
+    <w:p>
+      <w:pPr>
+        <w:pStyle w:val="Akapitzlist"/>
+        <w:numPr>
+          <w:ilvl w:val="0"/>
+          <w:numId w:val="3"/>
+        </w:numPr>
+        <w:spacing w:after="0" w:line="276" w:lineRule="auto"/>
+        <w:jc w:val="both"/>
+        <w:rPr>
+          <w:sz w:val="20"/>
+          <w:szCs w:val="20"/>
+        </w:rPr>
+      </w:pPr>
+      <w:r>
+        <w:rPr>
+          <w:b/>
+          <w:bCs/>
+          <w:sz w:val="20"/>
+          <w:szCs w:val="20"/>
+        </w:rPr>
+        <w:t>Inicjalizacja danych:</w:t>
+      </w:r>
+      <w:r>
+        <w:rPr>
+          <w:sz w:val="20"/>
+          <w:szCs w:val="20"/>
+        </w:rPr>
+        <w:t xml:space="preserve"> Po uruchomieniu programu zaleca się rozpoczęcie od opcji </w:t>
+      </w:r>
+      <w:r>
+        <w:rPr>
+          <w:b/>
+          <w:bCs/>
+          <w:sz w:val="20"/>
+          <w:szCs w:val="20"/>
+        </w:rPr>
+        <w:t>[</w:t>
+      </w:r>
+      <w:r>
+        <w:rPr>
+          <w:b/>
+          <w:bCs/>
+          <w:sz w:val="20"/>
+          <w:szCs w:val="20"/>
+        </w:rPr>
+        <w:t>8</w:t>
+      </w:r>
+      <w:r>
+        <w:rPr>
+          <w:b/>
+          <w:bCs/>
+          <w:sz w:val="20"/>
+          <w:szCs w:val="20"/>
+        </w:rPr>
+        <w:t>] Wczytaj stan ligi</w:t>
+      </w:r>
+      <w:r>
+        <w:rPr>
+          <w:sz w:val="20"/>
+          <w:szCs w:val="20"/>
+        </w:rPr>
+        <w:t xml:space="preserve"> </w:t>
+      </w:r>
+      <w:r>
+        <w:rPr>
+          <w:sz w:val="20"/>
+          <w:szCs w:val="20"/>
+        </w:rPr>
+        <w:br/>
+      </w:r>
+      <w:r>
+        <w:rPr>
+          <w:sz w:val="20"/>
+          <w:szCs w:val="20"/>
+        </w:rPr>
+        <w:t xml:space="preserve">i podania pliku tabela.txt, co załaduje gotowy zestaw drużyn do pamięci. Alternatywnie, bazę można zbudować od zera używając opcji </w:t>
+      </w:r>
+      <w:r>
+        <w:rPr>
+          <w:b/>
+          <w:bCs/>
+          <w:sz w:val="20"/>
+          <w:szCs w:val="20"/>
+        </w:rPr>
+        <w:t>[1] Dodaj drużynę</w:t>
+      </w:r>
+    </w:p>
+    <w:p>
+      <w:pPr>
+        <w:pStyle w:val="Akapitzlist"/>
+        <w:numPr>
+          <w:ilvl w:val="0"/>
+          <w:numId w:val="3"/>
+        </w:numPr>
+        <w:spacing w:after="0" w:line="276" w:lineRule="auto"/>
+        <w:jc w:val="both"/>
+        <w:rPr>
+          <w:sz w:val="20"/>
+          <w:szCs w:val="20"/>
+        </w:rPr>
+      </w:pPr>
+      <w:r>
+        <w:rPr>
+          <w:b/>
+          <w:bCs/>
+          <w:sz w:val="20"/>
+          <w:szCs w:val="20"/>
+        </w:rPr>
+        <w:t>Generowanie kalendarza:</w:t>
+      </w:r>
+      <w:r>
+        <w:rPr>
+          <w:sz w:val="20"/>
+          <w:szCs w:val="20"/>
+        </w:rPr>
+        <w:t xml:space="preserve"> Wybranie opcji </w:t>
+      </w:r>
+      <w:r>
+        <w:rPr>
+          <w:b/>
+          <w:bCs/>
+          <w:sz w:val="20"/>
+          <w:szCs w:val="20"/>
+        </w:rPr>
+        <w:t>[</w:t>
+      </w:r>
+      <w:r>
+        <w:rPr>
+          <w:b/>
+          <w:bCs/>
+          <w:sz w:val="20"/>
+          <w:szCs w:val="20"/>
+        </w:rPr>
+        <w:t>5</w:t>
+      </w:r>
+      <w:r>
+        <w:rPr>
+          <w:b/>
+          <w:bCs/>
+          <w:sz w:val="20"/>
+          <w:szCs w:val="20"/>
+        </w:rPr>
+        <w:t>] Generuj terminarz</w:t>
+      </w:r>
+      <w:r>
+        <w:rPr>
+          <w:sz w:val="20"/>
+          <w:szCs w:val="20"/>
+        </w:rPr>
+        <w:t xml:space="preserve"> utworzy zautomatyzowaną listę spotkań</w:t>
+      </w:r>
+      <w:r>
+        <w:rPr>
+          <w:sz w:val="20"/>
+          <w:szCs w:val="20"/>
+        </w:rPr>
+        <w:t xml:space="preserve">, </w:t>
+      </w:r>
+      <w:r>
+        <w:rPr>
+          <w:sz w:val="20"/>
+          <w:szCs w:val="20"/>
+        </w:rPr>
+        <w:t xml:space="preserve">którą następnie można przejrzeć używając opcji </w:t>
+      </w:r>
+      <w:r>
+        <w:rPr>
+          <w:b/>
+          <w:bCs/>
+          <w:sz w:val="20"/>
+          <w:szCs w:val="20"/>
+        </w:rPr>
+        <w:t>[</w:t>
+      </w:r>
+      <w:r>
+        <w:rPr>
+          <w:b/>
+          <w:bCs/>
+          <w:sz w:val="20"/>
+          <w:szCs w:val="20"/>
+        </w:rPr>
+        <w:t>6</w:t>
+      </w:r>
+      <w:r>
+        <w:rPr>
+          <w:b/>
+          <w:bCs/>
+          <w:sz w:val="20"/>
+          <w:szCs w:val="20"/>
+        </w:rPr>
+        <w:t>] Wyświetl terminarz</w:t>
+      </w:r>
+    </w:p>
+    <w:p>
+      <w:pPr>
+        <w:pStyle w:val="Akapitzlist"/>
+        <w:numPr>
+          <w:ilvl w:val="0"/>
+          <w:numId w:val="3"/>
+        </w:numPr>
+        <w:spacing w:after="0" w:line="276" w:lineRule="auto"/>
+        <w:jc w:val="both"/>
+        <w:rPr>
+          <w:sz w:val="20"/>
+          <w:szCs w:val="20"/>
+        </w:rPr>
+      </w:pPr>
+      <w:r>
+        <w:rPr>
+          <w:b/>
+          <w:bCs/>
+          <w:sz w:val="20"/>
+          <w:szCs w:val="20"/>
+        </w:rPr>
+        <w:t>Symulacja rozgrywek:</w:t>
+      </w:r>
+      <w:r>
+        <w:rPr>
+          <w:sz w:val="20"/>
+          <w:szCs w:val="20"/>
+        </w:rPr>
+        <w:t xml:space="preserve"> Opcja </w:t>
+      </w:r>
+      <w:r>
+        <w:rPr>
+          <w:b/>
+          <w:bCs/>
+          <w:sz w:val="20"/>
+          <w:szCs w:val="20"/>
+        </w:rPr>
+        <w:t>[</w:t>
+      </w:r>
+      <w:r>
+        <w:rPr>
+          <w:b/>
+          <w:bCs/>
+          <w:sz w:val="20"/>
+          <w:szCs w:val="20"/>
+        </w:rPr>
+        <w:t>4</w:t>
+      </w:r>
+      <w:r>
+        <w:rPr>
+          <w:b/>
+          <w:bCs/>
+          <w:sz w:val="20"/>
+          <w:szCs w:val="20"/>
+        </w:rPr>
+        <w:t>] Rozegraj mecz</w:t>
+      </w:r>
+      <w:r>
+        <w:rPr>
+          <w:sz w:val="20"/>
+          <w:szCs w:val="20"/>
+        </w:rPr>
+        <w:t xml:space="preserve"> pozwala na wpisanie nazw gospodarza i gościa oraz wyniku spotkania. Program automatycznie przeliczy i przydzieli odpowiednie punkty oraz zaktualizuje bilans bramkowy</w:t>
+      </w:r>
+    </w:p>
+    <w:p>
+      <w:pPr>
+        <w:pStyle w:val="Akapitzlist"/>
+        <w:numPr>
+          <w:ilvl w:val="0"/>
+          <w:numId w:val="3"/>
+        </w:numPr>
+        <w:spacing w:after="0" w:line="276" w:lineRule="auto"/>
+        <w:jc w:val="both"/>
+        <w:rPr>
+          <w:sz w:val="20"/>
+          <w:szCs w:val="20"/>
+        </w:rPr>
+      </w:pPr>
+      <w:r>
+        <w:rPr>
+          <w:b/>
+          <w:bCs/>
+          <w:sz w:val="20"/>
+          <w:szCs w:val="20"/>
+        </w:rPr>
+        <w:t>Podgląd wyników:</w:t>
+      </w:r>
+      <w:r>
+        <w:rPr>
+          <w:sz w:val="20"/>
+          <w:szCs w:val="20"/>
+        </w:rPr>
+        <w:t xml:space="preserve"> Użycie opcji </w:t>
+      </w:r>
+      <w:r>
+        <w:rPr>
+          <w:b/>
+          <w:bCs/>
+          <w:sz w:val="20"/>
+          <w:szCs w:val="20"/>
+        </w:rPr>
+        <w:t>[</w:t>
+      </w:r>
+      <w:r>
+        <w:rPr>
+          <w:b/>
+          <w:bCs/>
+          <w:sz w:val="20"/>
+          <w:szCs w:val="20"/>
+        </w:rPr>
+        <w:t>3</w:t>
+      </w:r>
+      <w:r>
+        <w:rPr>
+          <w:b/>
+          <w:bCs/>
+          <w:sz w:val="20"/>
+          <w:szCs w:val="20"/>
+        </w:rPr>
+        <w:t>] Wyświetl tabelę ligową</w:t>
+      </w:r>
+      <w:r>
+        <w:rPr>
+          <w:sz w:val="20"/>
+          <w:szCs w:val="20"/>
+        </w:rPr>
+        <w:t xml:space="preserve"> w dowolnym momencie zaprezentuje aktualny, posortowany ranking drużyn</w:t>
+      </w:r>
+    </w:p>
+    <w:p>
+      <w:pPr>
+        <w:pStyle w:val="Akapitzlist"/>
+        <w:numPr>
+          <w:ilvl w:val="0"/>
+          <w:numId w:val="3"/>
+        </w:numPr>
+        <w:spacing w:after="0" w:line="276" w:lineRule="auto"/>
+        <w:jc w:val="both"/>
+        <w:rPr>
+          <w:sz w:val="20"/>
+          <w:szCs w:val="20"/>
+        </w:rPr>
+      </w:pPr>
+      <w:r>
+        <w:rPr>
+          <w:b/>
+          <w:bCs/>
+          <w:sz w:val="20"/>
+          <w:szCs w:val="20"/>
+        </w:rPr>
+        <w:drawing>
+          <wp:anchor distT="0" distB="0" distL="114300" distR="114300" simplePos="0" relativeHeight="251669504" behindDoc="0" locked="0" layoutInCell="1" allowOverlap="1" wp14:anchorId="32B171C7" wp14:editId="2A46509D">
+            <wp:simplePos x="0" y="0"/>
+            <wp:positionH relativeFrom="column">
+              <wp:posOffset>-267335</wp:posOffset>
+            </wp:positionH>
+            <wp:positionV relativeFrom="paragraph">
+              <wp:posOffset>476885</wp:posOffset>
+            </wp:positionV>
+            <wp:extent cx="2545080" cy="1841500"/>
+            <wp:effectExtent l="0" t="0" r="7620" b="6350"/>
+            <wp:wrapTopAndBottom/>
+            <wp:docPr id="1609187845" name="Obraz 1"/>
+            <wp:cNvGraphicFramePr>
+              <a:graphicFrameLocks xmlns:a="http://schemas.openxmlformats.org/drawingml/2006/main" noChangeAspect="1"/>
+            </wp:cNvGraphicFramePr>
+            <a:graphic xmlns:a="http://schemas.openxmlformats.org/drawingml/2006/main">
+              <a:graphicData uri="http://schemas.openxmlformats.org/drawingml/2006/picture">
+                <pic:pic xmlns:pic="http://schemas.openxmlformats.org/drawingml/2006/picture">
+                  <pic:nvPicPr>
+                    <pic:cNvPr id="1609187845" name=""/>
+                    <pic:cNvPicPr/>
+                  </pic:nvPicPr>
+                  <pic:blipFill>
+                    <a:blip r:embed="rId7">
+                      <a:extLst>
+                        <a:ext uri="{28A0092B-C50C-407E-A947-70E740481C1C}">
+                          <a14:useLocalDpi xmlns:a14="http://schemas.microsoft.com/office/drawing/2010/main" val="0"/>
+                        </a:ext>
+                      </a:extLst>
+                    </a:blip>
+                    <a:stretch>
+                      <a:fillRect/>
+                    </a:stretch>
+                  </pic:blipFill>
+                  <pic:spPr>
+                    <a:xfrm>
+                      <a:off x="0" y="0"/>
+                      <a:ext cx="2545080" cy="1841500"/>
+                    </a:xfrm>
+                    <a:prstGeom prst="rect">
+                      <a:avLst/>
+                    </a:prstGeom>
+                  </pic:spPr>
+                </pic:pic>
+              </a:graphicData>
+            </a:graphic>
+            <wp14:sizeRelH relativeFrom="margin">
+              <wp14:pctWidth>0</wp14:pctWidth>
+            </wp14:sizeRelH>
+            <wp14:sizeRelV relativeFrom="margin">
+              <wp14:pctHeight>0</wp14:pctHeight>
+            </wp14:sizeRelV>
+          </wp:anchor>
+        </w:drawing>
+      </w:r>
+      <w:r>
+        <w:rPr>
+          <w:b/>
+          <w:bCs/>
+          <w:sz w:val="20"/>
+          <w:szCs w:val="20"/>
+        </w:rPr>
+        <w:t>Zapis pracy:</w:t>
+      </w:r>
+      <w:r>
+        <w:rPr>
+          <w:sz w:val="20"/>
+          <w:szCs w:val="20"/>
+        </w:rPr>
+        <w:t xml:space="preserve"> Przed zamknięciem programu należy użyć opcji </w:t>
+      </w:r>
+      <w:r>
+        <w:rPr>
+          <w:b/>
+          <w:bCs/>
+          <w:sz w:val="20"/>
+          <w:szCs w:val="20"/>
+        </w:rPr>
+        <w:t>[</w:t>
+      </w:r>
+      <w:r>
+        <w:rPr>
+          <w:b/>
+          <w:bCs/>
+          <w:sz w:val="20"/>
+          <w:szCs w:val="20"/>
+        </w:rPr>
+        <w:t>7</w:t>
+      </w:r>
+      <w:r>
+        <w:rPr>
+          <w:b/>
+          <w:bCs/>
+          <w:sz w:val="20"/>
+          <w:szCs w:val="20"/>
+        </w:rPr>
+        <w:t>] Zapisz stan ligi</w:t>
+      </w:r>
+      <w:r>
+        <w:rPr>
+          <w:sz w:val="20"/>
+          <w:szCs w:val="20"/>
+        </w:rPr>
+        <w:t>, aby bezpiecznie wyeksportować zaktualizowane statystyki do pliku tekstowego</w:t>
+      </w:r>
+    </w:p>
+    <w:p>
+      <w:pPr>
+        <w:pStyle w:val="Akapitzlist"/>
+        <w:spacing w:after="0" w:line="276" w:lineRule="auto"/>
+        <w:ind w:left="502" w:firstLine="0"/>
+        <w:jc w:val="both"/>
+        <w:rPr>
+          <w:b/>
+          <w:bCs/>
+          <w:sz w:val="20"/>
+          <w:szCs w:val="20"/>
+        </w:rPr>
+      </w:pPr>
+    </w:p>
+    <w:p>
+      <w:pPr>
+        <w:pStyle w:val="Akapitzlist"/>
+        <w:spacing w:after="0" w:line="276" w:lineRule="auto"/>
+        <w:ind w:left="502" w:firstLine="0"/>
+        <w:jc w:val="both"/>
+        <w:rPr>
+          <w:sz w:val="20"/>
+          <w:szCs w:val="20"/>
+        </w:rPr>
+      </w:pPr>
+    </w:p>
+    <w:p>
+      <w:pPr>
+        <w:pStyle w:val="Akapitzlist"/>
+        <w:spacing w:after="0" w:line="276" w:lineRule="auto"/>
+        <w:ind w:left="502" w:firstLine="0"/>
+        <w:jc w:val="both"/>
+        <w:rPr>
+          <w:sz w:val="20"/>
+          <w:szCs w:val="20"/>
+        </w:rPr>
+      </w:pPr>
+      <w:r>
+        <w:rPr>
+          <w:b/>
+          <w:bCs/>
+          <w:noProof/>
           <w:sz w:val="22"/>
           <w:szCs w:val="22"/>
         </w:rPr>
+        <w:drawing>
+          <wp:anchor distT="0" distB="0" distL="114300" distR="114300" simplePos="0" relativeHeight="251663360" behindDoc="0" locked="0" layoutInCell="1" allowOverlap="1" wp14:anchorId="5BFF03F1" wp14:editId="0F5D06CC">
+            <wp:simplePos x="0" y="0"/>
+            <wp:positionH relativeFrom="margin">
+              <wp:posOffset>3053715</wp:posOffset>
+            </wp:positionH>
+            <wp:positionV relativeFrom="margin">
+              <wp:posOffset>3612938</wp:posOffset>
+            </wp:positionV>
+            <wp:extent cx="3338195" cy="3218815"/>
+            <wp:effectExtent l="0" t="0" r="0" b="635"/>
+            <wp:wrapSquare wrapText="bothSides"/>
+            <wp:docPr id="1232952867" name="Obraz 1"/>
+            <wp:cNvGraphicFramePr>
+              <a:graphicFrameLocks xmlns:a="http://schemas.openxmlformats.org/drawingml/2006/main" noChangeAspect="1"/>
+            </wp:cNvGraphicFramePr>
+            <a:graphic xmlns:a="http://schemas.openxmlformats.org/drawingml/2006/main">
+              <a:graphicData uri="http://schemas.openxmlformats.org/drawingml/2006/picture">
+                <pic:pic xmlns:pic="http://schemas.openxmlformats.org/drawingml/2006/picture">
+                  <pic:nvPicPr>
+                    <pic:cNvPr id="1232952867" name=""/>
+                    <pic:cNvPicPr/>
+                  </pic:nvPicPr>
+                  <pic:blipFill>
+                    <a:blip r:embed="rId8">
+                      <a:extLst>
+                        <a:ext uri="{28A0092B-C50C-407E-A947-70E740481C1C}">
+                          <a14:useLocalDpi xmlns:a14="http://schemas.microsoft.com/office/drawing/2010/main" val="0"/>
+                        </a:ext>
+                      </a:extLst>
+                    </a:blip>
+                    <a:stretch>
+                      <a:fillRect/>
+                    </a:stretch>
+                  </pic:blipFill>
+                  <pic:spPr>
+                    <a:xfrm>
+                      <a:off x="0" y="0"/>
+                      <a:ext cx="3338195" cy="3218815"/>
+                    </a:xfrm>
+                    <a:prstGeom prst="rect">
+                      <a:avLst/>
+                    </a:prstGeom>
+                  </pic:spPr>
+                </pic:pic>
+              </a:graphicData>
+            </a:graphic>
+            <wp14:sizeRelH relativeFrom="margin">
+              <wp14:pctWidth>0</wp14:pctWidth>
+            </wp14:sizeRelH>
+            <wp14:sizeRelV relativeFrom="margin">
+              <wp14:pctHeight>0</wp14:pctHeight>
+            </wp14:sizeRelV>
+          </wp:anchor>
+        </w:drawing>
+      </w:r>
+    </w:p>
+    <w:p>
+      <w:pPr>
+        <w:spacing w:after="0" w:line="240" w:lineRule="auto"/>
+        <w:ind w:left="0" w:firstLine="0"/>
+        <w:jc w:val="both"/>
+        <w:rPr>
+          <w:b/>
+          <w:bCs/>
+          <w:sz w:val="22"/>
+          <w:szCs w:val="22"/>
+        </w:rPr>
+      </w:pPr>
+    </w:p>
+    <w:p>
+      <w:pPr>
+        <w:spacing w:after="0" w:line="240" w:lineRule="auto"/>
+        <w:ind w:left="0" w:firstLine="0"/>
+        <w:jc w:val="both"/>
+        <w:rPr>
+          <w:b/>
+          <w:bCs/>
+          <w:sz w:val="22"/>
+          <w:szCs w:val="22"/>
+        </w:rPr>
+      </w:pPr>
+    </w:p>
+    <w:p>
+      <w:pPr>
+        <w:spacing w:after="0" w:line="240" w:lineRule="auto"/>
+        <w:ind w:left="0" w:firstLine="0"/>
+        <w:jc w:val="both"/>
+        <w:rPr>
+          <w:b/>
+          <w:bCs/>
+          <w:sz w:val="22"/>
+          <w:szCs w:val="22"/>
+        </w:rPr>
+      </w:pPr>
+    </w:p>
+    <w:p>
+      <w:pPr>
+        <w:spacing w:after="0" w:line="240" w:lineRule="auto"/>
+        <w:ind w:left="0" w:firstLine="0"/>
+        <w:jc w:val="both"/>
+        <w:rPr>
+          <w:b/>
+          <w:bCs/>
+          <w:sz w:val="22"/>
+          <w:szCs w:val="22"/>
+        </w:rPr>
+      </w:pPr>
+    </w:p>
+    <w:p>
+      <w:pPr>
+        <w:spacing w:after="0" w:line="240" w:lineRule="auto"/>
+        <w:ind w:left="0" w:firstLine="0"/>
+        <w:jc w:val="both"/>
+        <w:rPr>
+          <w:b/>
+          <w:bCs/>
+          <w:sz w:val="22"/>
+          <w:szCs w:val="22"/>
+        </w:rPr>
+      </w:pPr>
+    </w:p>
+    <w:p>
+      <w:pPr>
+        <w:spacing w:after="0" w:line="240" w:lineRule="auto"/>
+        <w:ind w:left="0" w:firstLine="0"/>
+        <w:jc w:val="both"/>
+        <w:rPr>
+          <w:b/>
+          <w:bCs/>
+          <w:sz w:val="22"/>
+          <w:szCs w:val="22"/>
+        </w:rPr>
+      </w:pPr>
+    </w:p>
+    <w:p>
+      <w:pPr>
+        <w:spacing w:after="0" w:line="240" w:lineRule="auto"/>
+        <w:ind w:left="0" w:firstLine="0"/>
+        <w:jc w:val="both"/>
+        <w:rPr>
+          <w:b/>
+          <w:bCs/>
+          <w:sz w:val="22"/>
+          <w:szCs w:val="22"/>
+        </w:rPr>
+      </w:pPr>
+    </w:p>
+    <w:p>
+      <w:pPr>
+        <w:spacing w:after="0" w:line="240" w:lineRule="auto"/>
+        <w:ind w:left="0" w:firstLine="0"/>
+        <w:jc w:val="both"/>
+        <w:rPr>
+          <w:b/>
+          <w:bCs/>
+          <w:sz w:val="22"/>
+          <w:szCs w:val="22"/>
+        </w:rPr>
+      </w:pPr>
+      <w:r>
+        <w:rPr>
+          <w:noProof/>
+        </w:rPr>
+        <mc:AlternateContent>
+          <mc:Choice Requires="wps">
+            <w:drawing>
+              <wp:anchor distT="45720" distB="45720" distL="114300" distR="114300" simplePos="0" relativeHeight="251661312" behindDoc="0" locked="0" layoutInCell="1" allowOverlap="1" wp14:anchorId="3ED803CE" wp14:editId="0F3F627D">
+                <wp:simplePos x="0" y="0"/>
+                <wp:positionH relativeFrom="page">
+                  <wp:posOffset>289349</wp:posOffset>
+                </wp:positionH>
+                <wp:positionV relativeFrom="bottomMargin">
+                  <wp:posOffset>-3724910</wp:posOffset>
+                </wp:positionV>
+                <wp:extent cx="3001645" cy="476250"/>
+                <wp:effectExtent l="0" t="0" r="0" b="0"/>
+                <wp:wrapSquare wrapText="bothSides"/>
+                <wp:docPr id="787426113" name="Pole tekstowe 2"/>
+                <wp:cNvGraphicFramePr>
+                  <a:graphicFrameLocks xmlns:a="http://schemas.openxmlformats.org/drawingml/2006/main"/>
+                </wp:cNvGraphicFramePr>
+                <a:graphic xmlns:a="http://schemas.openxmlformats.org/drawingml/2006/main">
+                  <a:graphicData uri="http://schemas.microsoft.com/office/word/2010/wordprocessingShape">
+                    <wps:wsp>
+                      <wps:cNvSpPr txBox="1">
+                        <a:spLocks noChangeArrowheads="1"/>
+                      </wps:cNvSpPr>
+                      <wps:spPr bwMode="auto">
+                        <a:xfrm>
+                          <a:off x="0" y="0"/>
+                          <a:ext cx="3001645" cy="476250"/>
+                        </a:xfrm>
+                        <a:prstGeom prst="rect">
+                          <a:avLst/>
+                        </a:prstGeom>
+                        <a:noFill/>
+                        <a:ln w="9525">
+                          <a:noFill/>
+                          <a:miter lim="800000"/>
+                          <a:headEnd/>
+                          <a:tailEnd/>
+                        </a:ln>
+                      </wps:spPr>
+                      <wps:txbx>
+                        <w:txbxContent>
+                          <w:p>
+                            <w:pPr>
+                              <w:spacing w:after="0"/>
+                              <w:ind w:left="0" w:firstLine="0"/>
+                              <w:jc w:val="center"/>
+                              <w:rPr>
+                                <w:color w:val="3B3838" w:themeColor="background2" w:themeShade="40"/>
+                                <w:sz w:val="18"/>
+                                <w:szCs w:val="18"/>
+                              </w:rPr>
+                            </w:pPr>
+                            <w:r>
+                              <w:rPr>
+                                <w:color w:val="3B3838" w:themeColor="background2" w:themeShade="40"/>
+                                <w:sz w:val="18"/>
+                                <w:szCs w:val="18"/>
+                              </w:rPr>
+                              <w:t>Rys. 1</w:t>
+                            </w:r>
+                          </w:p>
+                          <w:p>
+                            <w:pPr>
+                              <w:spacing w:after="0"/>
+                              <w:ind w:left="0" w:firstLine="0"/>
+                              <w:jc w:val="center"/>
+                              <w:rPr>
+                                <w:color w:val="3B3838" w:themeColor="background2" w:themeShade="40"/>
+                                <w:sz w:val="18"/>
+                                <w:szCs w:val="18"/>
+                              </w:rPr>
+                            </w:pPr>
+                            <w:r>
+                              <w:rPr>
+                                <w:color w:val="3B3838" w:themeColor="background2" w:themeShade="40"/>
+                                <w:sz w:val="18"/>
+                                <w:szCs w:val="18"/>
+                              </w:rPr>
+                              <w:t>Widok menu głównego</w:t>
+                            </w:r>
+                          </w:p>
+                        </w:txbxContent>
+                      </wps:txbx>
+                      <wps:bodyPr rot="0" vert="horz" wrap="square" lIns="91440" tIns="45720" rIns="91440" bIns="45720" anchor="t" anchorCtr="0">
+                        <a:noAutofit/>
+                      </wps:bodyPr>
+                    </wps:wsp>
+                  </a:graphicData>
+                </a:graphic>
+                <wp14:sizeRelH relativeFrom="margin">
+                  <wp14:pctWidth>0</wp14:pctWidth>
+                </wp14:sizeRelH>
+                <wp14:sizeRelV relativeFrom="margin">
+                  <wp14:pctHeight>0</wp14:pctHeight>
+                </wp14:sizeRelV>
+              </wp:anchor>
+            </w:drawing>
+          </mc:Choice>
+          <mc:Fallback>
+            <w:pict>
+              <v:shapetype w14:anchorId="3ED803CE" id="_x0000_t202" coordsize="21600,21600" o:spt="202" path="m,l,21600r21600,l21600,xe">
+                <v:stroke joinstyle="miter"/>
+                <v:path gradientshapeok="t" o:connecttype="rect"/>
+              </v:shapetype>
+              <v:shape id="Pole tekstowe 2" o:spid="_x0000_s1026" type="#_x0000_t202" style="position:absolute;left:0;text-align:left;margin-left:22.8pt;margin-top:-293.3pt;width:236.35pt;height:37.5pt;z-index:251661312;visibility:visible;mso-wrap-style:square;mso-width-percent:0;mso-height-percent:0;mso-wrap-distance-left:9pt;mso-wrap-distance-top:3.6pt;mso-wrap-distance-right:9pt;mso-wrap-distance-bottom:3.6pt;mso-position-horizontal:absolute;mso-position-horizontal-relative:page;mso-position-vertical:absolute;mso-position-vertical-relative:bottom-margin-area;mso-width-percent:0;mso-height-percent:0;mso-width-relative:margin;mso-height-relative:margin;v-text-anchor:top" o:gfxdata="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" filled="f" stroked="f">
+                <v:textbox>
+                  <w:txbxContent>
+                    <w:p>
+                      <w:pPr>
+                        <w:spacing w:after="0"/>
+                        <w:ind w:left="0" w:firstLine="0"/>
+                        <w:jc w:val="center"/>
+                        <w:rPr>
+                          <w:color w:val="3B3838" w:themeColor="background2" w:themeShade="40"/>
+                          <w:sz w:val="18"/>
+                          <w:szCs w:val="18"/>
+                        </w:rPr>
+                      </w:pPr>
+                      <w:r>
+                        <w:rPr>
+                          <w:color w:val="3B3838" w:themeColor="background2" w:themeShade="40"/>
+                          <w:sz w:val="18"/>
+                          <w:szCs w:val="18"/>
+                        </w:rPr>
+                        <w:t>Rys. 1</w:t>
+                      </w:r>
+                    </w:p>
+                    <w:p>
+                      <w:pPr>
+                        <w:spacing w:after="0"/>
+                        <w:ind w:left="0" w:firstLine="0"/>
+                        <w:jc w:val="center"/>
+                        <w:rPr>
+                          <w:color w:val="3B3838" w:themeColor="background2" w:themeShade="40"/>
+                          <w:sz w:val="18"/>
+                          <w:szCs w:val="18"/>
+                        </w:rPr>
+                      </w:pPr>
+                      <w:r>
+                        <w:rPr>
+                          <w:color w:val="3B3838" w:themeColor="background2" w:themeShade="40"/>
+                          <w:sz w:val="18"/>
+                          <w:szCs w:val="18"/>
+                        </w:rPr>
+                        <w:t>Widok menu głównego</w:t>
+                      </w:r>
+                    </w:p>
+                  </w:txbxContent>
+                </v:textbox>
+                <w10:wrap type="square" anchorx="page" anchory="margin"/>
+              </v:shape>
+            </w:pict>
+          </mc:Fallback>
+        </mc:AlternateContent>
+      </w:r>
+    </w:p>
+    <w:p>
+      <w:pPr>
+        <w:spacing w:after="0" w:line="240" w:lineRule="auto"/>
+        <w:ind w:left="0" w:firstLine="0"/>
+        <w:jc w:val="both"/>
+        <w:rPr>
+          <w:b/>
+          <w:bCs/>
+          <w:sz w:val="22"/>
+          <w:szCs w:val="22"/>
+        </w:rPr>
+      </w:pPr>
+      <w:r>
+        <w:rPr>
+          <w:noProof/>
+        </w:rPr>
+        <mc:AlternateContent>
+          <mc:Choice Requires="wps">
+            <w:drawing>
+              <wp:anchor distT="45720" distB="45720" distL="114300" distR="114300" simplePos="0" relativeHeight="251667456" behindDoc="0" locked="0" layoutInCell="1" allowOverlap="1" wp14:anchorId="7B6CCF34" wp14:editId="0A4BF79D">
+                <wp:simplePos x="0" y="0"/>
+                <wp:positionH relativeFrom="page">
+                  <wp:posOffset>288290</wp:posOffset>
+                </wp:positionH>
+                <wp:positionV relativeFrom="margin">
+                  <wp:posOffset>8230235</wp:posOffset>
+                </wp:positionV>
+                <wp:extent cx="3001645" cy="476250"/>
+                <wp:effectExtent l="0" t="0" r="0" b="0"/>
+                <wp:wrapSquare wrapText="bothSides"/>
+                <wp:docPr id="567243211" name="Pole tekstowe 2"/>
+                <wp:cNvGraphicFramePr>
+                  <a:graphicFrameLocks xmlns:a="http://schemas.openxmlformats.org/drawingml/2006/main"/>
+                </wp:cNvGraphicFramePr>
+                <a:graphic xmlns:a="http://schemas.openxmlformats.org/drawingml/2006/main">
+                  <a:graphicData uri="http://schemas.microsoft.com/office/word/2010/wordprocessingShape">
+                    <wps:wsp>
+                      <wps:cNvSpPr txBox="1">
+                        <a:spLocks noChangeArrowheads="1"/>
+                      </wps:cNvSpPr>
+                      <wps:spPr bwMode="auto">
+                        <a:xfrm>
+                          <a:off x="0" y="0"/>
+                          <a:ext cx="3001645" cy="476250"/>
+                        </a:xfrm>
+                        <a:prstGeom prst="rect">
+                          <a:avLst/>
+                        </a:prstGeom>
+                        <a:noFill/>
+                        <a:ln w="9525">
+                          <a:noFill/>
+                          <a:miter lim="800000"/>
+                          <a:headEnd/>
+                          <a:tailEnd/>
+                        </a:ln>
+                      </wps:spPr>
+                      <wps:txbx>
+                        <w:txbxContent>
+                          <w:p>
+                            <w:pPr>
+                              <w:spacing w:after="0"/>
+                              <w:ind w:left="0" w:firstLine="0"/>
+                              <w:jc w:val="center"/>
+                              <w:rPr>
+                                <w:color w:val="3B3838" w:themeColor="background2" w:themeShade="40"/>
+                                <w:sz w:val="18"/>
+                                <w:szCs w:val="18"/>
+                              </w:rPr>
+                            </w:pPr>
+                            <w:r>
+                              <w:rPr>
+                                <w:color w:val="3B3838" w:themeColor="background2" w:themeShade="40"/>
+                                <w:sz w:val="18"/>
+                                <w:szCs w:val="18"/>
+                              </w:rPr>
+                              <w:t>Rys. 3</w:t>
+                            </w:r>
+                          </w:p>
+                          <w:p>
+                            <w:pPr>
+                              <w:spacing w:after="0"/>
+                              <w:ind w:left="0" w:firstLine="0"/>
+                              <w:jc w:val="center"/>
+                              <w:rPr>
+                                <w:color w:val="3B3838" w:themeColor="background2" w:themeShade="40"/>
+                                <w:sz w:val="18"/>
+                                <w:szCs w:val="18"/>
+                              </w:rPr>
+                            </w:pPr>
+                            <w:r>
+                              <w:rPr>
+                                <w:color w:val="3B3838" w:themeColor="background2" w:themeShade="40"/>
+                                <w:sz w:val="18"/>
+                                <w:szCs w:val="18"/>
+                              </w:rPr>
+                              <w:t>Fragment wygenerowanego terminarza</w:t>
+                            </w:r>
+                          </w:p>
+                        </w:txbxContent>
+                      </wps:txbx>
+                      <wps:bodyPr rot="0" vert="horz" wrap="square" lIns="91440" tIns="45720" rIns="91440" bIns="45720" anchor="t" anchorCtr="0">
+                        <a:noAutofit/>
+                      </wps:bodyPr>
+                    </wps:wsp>
+                  </a:graphicData>
+                </a:graphic>
+                <wp14:sizeRelH relativeFrom="margin">
+                  <wp14:pctWidth>0</wp14:pctWidth>
+                </wp14:sizeRelH>
+                <wp14:sizeRelV relativeFrom="margin">
+                  <wp14:pctHeight>0</wp14:pctHeight>
+                </wp14:sizeRelV>
+              </wp:anchor>
+            </w:drawing>
+          </mc:Choice>
+          <mc:Fallback>
+            <w:pict>
+              <v:shapetype w14:anchorId="7B6CCF34" id="_x0000_t202" coordsize="21600,21600" o:spt="202" path="m,l,21600r21600,l21600,xe">
+                <v:stroke joinstyle="miter"/>
+                <v:path gradientshapeok="t" o:connecttype="rect"/>
+              </v:shapetype>
+              <v:shape id="_x0000_s1027" type="#_x0000_t202" style="position:absolute;left:0;text-align:left;margin-left:22.7pt;margin-top:648.05pt;width:236.35pt;height:37.5pt;z-index:251667456;visibility:visible;mso-wrap-style:square;mso-width-percent:0;mso-height-percent:0;mso-wrap-distance-left:9pt;mso-wrap-distance-top:3.6pt;mso-wrap-distance-right:9pt;mso-wrap-distance-bottom:3.6pt;mso-position-horizontal:absolute;mso-position-horizontal-relative:page;mso-position-vertical:absolute;mso-position-vertical-relative:margin;mso-width-percent:0;mso-height-percent:0;mso-width-relative:margin;mso-height-relative:margin;v-text-anchor:top" o:gfxdata="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" filled="f" stroked="f">
+                <v:textbox>
+                  <w:txbxContent>
+                    <w:p>
+                      <w:pPr>
+                        <w:spacing w:after="0"/>
+                        <w:ind w:left="0" w:firstLine="0"/>
+                        <w:jc w:val="center"/>
+                        <w:rPr>
+                          <w:color w:val="3B3838" w:themeColor="background2" w:themeShade="40"/>
+                          <w:sz w:val="18"/>
+                          <w:szCs w:val="18"/>
+                        </w:rPr>
+                      </w:pPr>
+                      <w:r>
+                        <w:rPr>
+                          <w:color w:val="3B3838" w:themeColor="background2" w:themeShade="40"/>
+                          <w:sz w:val="18"/>
+                          <w:szCs w:val="18"/>
+                        </w:rPr>
+                        <w:t>Rys. 3</w:t>
+                      </w:r>
+                    </w:p>
+                    <w:p>
+                      <w:pPr>
+                        <w:spacing w:after="0"/>
+                        <w:ind w:left="0" w:firstLine="0"/>
+                        <w:jc w:val="center"/>
+                        <w:rPr>
+                          <w:color w:val="3B3838" w:themeColor="background2" w:themeShade="40"/>
+                          <w:sz w:val="18"/>
+                          <w:szCs w:val="18"/>
+                        </w:rPr>
+                      </w:pPr>
+                      <w:r>
+                        <w:rPr>
+                          <w:color w:val="3B3838" w:themeColor="background2" w:themeShade="40"/>
+                          <w:sz w:val="18"/>
+                          <w:szCs w:val="18"/>
+                        </w:rPr>
+                        <w:t>Fragment wygenerowanego terminarza</w:t>
+                      </w:r>
+                    </w:p>
+                  </w:txbxContent>
+                </v:textbox>
+                <w10:wrap type="square" anchorx="page" anchory="margin"/>
+              </v:shape>
+            </w:pict>
+          </mc:Fallback>
+        </mc:AlternateContent>
+      </w:r>
+    </w:p>
+    <w:p>
+      <w:pPr>
+        <w:spacing w:after="0" w:line="240" w:lineRule="auto"/>
+        <w:ind w:left="0" w:firstLine="0"/>
+        <w:jc w:val="both"/>
+        <w:rPr>
+          <w:b/>
+          <w:bCs/>
+          <w:sz w:val="22"/>
+          <w:szCs w:val="22"/>
+        </w:rPr>
+      </w:pPr>
+    </w:p>
+    <w:p>
+      <w:pPr>
+        <w:spacing w:after="0" w:line="240" w:lineRule="auto"/>
+        <w:ind w:left="0" w:firstLine="0"/>
+        <w:jc w:val="both"/>
+        <w:rPr>
+          <w:b/>
+          <w:bCs/>
+          <w:sz w:val="22"/>
+          <w:szCs w:val="22"/>
+        </w:rPr>
+      </w:pPr>
+    </w:p>
+    <w:p>
+      <w:pPr>
+        <w:spacing w:after="0" w:line="240" w:lineRule="auto"/>
+        <w:ind w:left="0" w:firstLine="0"/>
+        <w:jc w:val="both"/>
+        <w:rPr>
+          <w:b/>
+          <w:bCs/>
+          <w:sz w:val="22"/>
+          <w:szCs w:val="22"/>
+        </w:rPr>
+      </w:pPr>
+      <w:r>
+        <w:rPr>
+          <w:b/>
+          <w:bCs/>
+          <w:noProof/>
+          <w:sz w:val="22"/>
+          <w:szCs w:val="22"/>
+        </w:rPr>
+        <w:drawing>
+          <wp:anchor distT="0" distB="0" distL="114300" distR="114300" simplePos="0" relativeHeight="251668480" behindDoc="0" locked="0" layoutInCell="1" allowOverlap="1" wp14:anchorId="70FD6ED3" wp14:editId="74CBB1B5">
+            <wp:simplePos x="0" y="0"/>
+            <wp:positionH relativeFrom="page">
+              <wp:posOffset>84031</wp:posOffset>
+            </wp:positionH>
+            <wp:positionV relativeFrom="margin">
+              <wp:posOffset>5894281</wp:posOffset>
+            </wp:positionV>
+            <wp:extent cx="3628390" cy="2184400"/>
+            <wp:effectExtent l="0" t="0" r="0" b="6350"/>
+            <wp:wrapSquare wrapText="bothSides"/>
+            <wp:docPr id="226444686" name="Obraz 1"/>
+            <wp:cNvGraphicFramePr>
+              <a:graphicFrameLocks xmlns:a="http://schemas.openxmlformats.org/drawingml/2006/main" noChangeAspect="1"/>
+            </wp:cNvGraphicFramePr>
+            <a:graphic xmlns:a="http://schemas.openxmlformats.org/drawingml/2006/main">
+              <a:graphicData uri="http://schemas.openxmlformats.org/drawingml/2006/picture">
+                <pic:pic xmlns:pic="http://schemas.openxmlformats.org/drawingml/2006/picture">
+                  <pic:nvPicPr>
+                    <pic:cNvPr id="226444686" name=""/>
+                    <pic:cNvPicPr/>
+                  </pic:nvPicPr>
+                  <pic:blipFill>
+                    <a:blip r:embed="rId9">
+                      <a:extLst>
+                        <a:ext uri="{28A0092B-C50C-407E-A947-70E740481C1C}">
+                          <a14:useLocalDpi xmlns:a14="http://schemas.microsoft.com/office/drawing/2010/main" val="0"/>
+                        </a:ext>
+                      </a:extLst>
+                    </a:blip>
+                    <a:stretch>
+                      <a:fillRect/>
+                    </a:stretch>
+                  </pic:blipFill>
+                  <pic:spPr>
+                    <a:xfrm>
+                      <a:off x="0" y="0"/>
+                      <a:ext cx="3628390" cy="2184400"/>
+                    </a:xfrm>
+                    <a:prstGeom prst="rect">
+                      <a:avLst/>
+                    </a:prstGeom>
+                  </pic:spPr>
+                </pic:pic>
+              </a:graphicData>
+            </a:graphic>
+            <wp14:sizeRelH relativeFrom="margin">
+              <wp14:pctWidth>0</wp14:pctWidth>
+            </wp14:sizeRelH>
+            <wp14:sizeRelV relativeFrom="margin">
+              <wp14:pctHeight>0</wp14:pctHeight>
+            </wp14:sizeRelV>
+          </wp:anchor>
+        </w:drawing>
+      </w:r>
+    </w:p>
+    <w:p>
+      <w:pPr>
+        <w:spacing w:after="0" w:line="240" w:lineRule="auto"/>
+        <w:ind w:left="0" w:firstLine="0"/>
+        <w:jc w:val="both"/>
+        <w:rPr>
+          <w:b/>
+          <w:bCs/>
+          <w:sz w:val="22"/>
+          <w:szCs w:val="22"/>
+        </w:rPr>
+      </w:pPr>
+      <w:r>
+        <w:rPr>
+          <w:noProof/>
+        </w:rPr>
+        <mc:AlternateContent>
+          <mc:Choice Requires="wps">
+            <w:drawing>
+              <wp:anchor distT="45720" distB="45720" distL="114300" distR="114300" simplePos="0" relativeHeight="251665408" behindDoc="0" locked="0" layoutInCell="1" allowOverlap="1" wp14:anchorId="3D838A7A" wp14:editId="2EABE66B">
+                <wp:simplePos x="0" y="0"/>
+                <wp:positionH relativeFrom="margin">
+                  <wp:posOffset>3292687</wp:posOffset>
+                </wp:positionH>
+                <wp:positionV relativeFrom="bottomMargin">
+                  <wp:posOffset>-1932940</wp:posOffset>
+                </wp:positionV>
+                <wp:extent cx="2857500" cy="476250"/>
+                <wp:effectExtent l="0" t="0" r="0" b="0"/>
+                <wp:wrapSquare wrapText="bothSides"/>
+                <wp:docPr id="406257274" name="Pole tekstowe 2"/>
+                <wp:cNvGraphicFramePr>
+                  <a:graphicFrameLocks xmlns:a="http://schemas.openxmlformats.org/drawingml/2006/main"/>
+                </wp:cNvGraphicFramePr>
+                <a:graphic xmlns:a="http://schemas.openxmlformats.org/drawingml/2006/main">
+                  <a:graphicData uri="http://schemas.microsoft.com/office/word/2010/wordprocessingShape">
+                    <wps:wsp>
+                      <wps:cNvSpPr txBox="1">
+                        <a:spLocks noChangeArrowheads="1"/>
+                      </wps:cNvSpPr>
+                      <wps:spPr bwMode="auto">
+                        <a:xfrm>
+                          <a:off x="0" y="0"/>
+                          <a:ext cx="2857500" cy="476250"/>
+                        </a:xfrm>
+                        <a:prstGeom prst="rect">
+                          <a:avLst/>
+                        </a:prstGeom>
+                        <a:noFill/>
+                        <a:ln w="9525">
+                          <a:noFill/>
+                          <a:miter lim="800000"/>
+                          <a:headEnd/>
+                          <a:tailEnd/>
+                        </a:ln>
+                      </wps:spPr>
+                      <wps:txbx>
+                        <w:txbxContent>
+                          <w:p>
+                            <w:pPr>
+                              <w:spacing w:after="0"/>
+                              <w:ind w:left="0" w:firstLine="0"/>
+                              <w:jc w:val="center"/>
+                              <w:rPr>
+                                <w:color w:val="3B3838" w:themeColor="background2" w:themeShade="40"/>
+                                <w:sz w:val="18"/>
+                                <w:szCs w:val="18"/>
+                              </w:rPr>
+                            </w:pPr>
+                            <w:r>
+                              <w:rPr>
+                                <w:color w:val="3B3838" w:themeColor="background2" w:themeShade="40"/>
+                                <w:sz w:val="18"/>
+                                <w:szCs w:val="18"/>
+                              </w:rPr>
+                              <w:t>Rys. 2</w:t>
+                            </w:r>
+                          </w:p>
+                          <w:p>
+                            <w:pPr>
+                              <w:spacing w:after="0"/>
+                              <w:ind w:left="0" w:firstLine="0"/>
+                              <w:jc w:val="center"/>
+                              <w:rPr>
+                                <w:color w:val="3B3838" w:themeColor="background2" w:themeShade="40"/>
+                                <w:sz w:val="18"/>
+                                <w:szCs w:val="18"/>
+                              </w:rPr>
+                            </w:pPr>
+                            <w:r>
+                              <w:rPr>
+                                <w:color w:val="3B3838" w:themeColor="background2" w:themeShade="40"/>
+                                <w:sz w:val="18"/>
+                                <w:szCs w:val="18"/>
+                              </w:rPr>
+                              <w:t>Widok sformatowanej tabeli ligowej</w:t>
+                            </w:r>
+                          </w:p>
+                        </w:txbxContent>
+                      </wps:txbx>
+                      <wps:bodyPr rot="0" vert="horz" wrap="square" lIns="91440" tIns="45720" rIns="91440" bIns="45720" anchor="t" anchorCtr="0">
+                        <a:noAutofit/>
+                      </wps:bodyPr>
+                    </wps:wsp>
+                  </a:graphicData>
+                </a:graphic>
+                <wp14:sizeRelH relativeFrom="margin">
+                  <wp14:pctWidth>0</wp14:pctWidth>
+                </wp14:sizeRelH>
+                <wp14:sizeRelV relativeFrom="margin">
+                  <wp14:pctHeight>0</wp14:pctHeight>
+                </wp14:sizeRelV>
+              </wp:anchor>
+            </w:drawing>
+          </mc:Choice>
+          <mc:Fallback>
+            <w:pict>
+              <v:shape w14:anchorId="3D838A7A" id="_x0000_s1027" type="#_x0000_t202" style="position:absolute;left:0;text-align:left;margin-left:259.25pt;margin-top:-152.2pt;width:225pt;height:37.5pt;z-index:251665408;visibility:visible;mso-wrap-style:square;mso-width-percent:0;mso-height-percent:0;mso-wrap-distance-left:9pt;mso-wrap-distance-top:3.6pt;mso-wrap-distance-right:9pt;mso-wrap-distance-bottom:3.6pt;mso-position-horizontal:absolute;mso-position-horizontal-relative:margin;mso-position-vertical:absolute;mso-position-vertical-relative:bottom-margin-area;mso-width-percent:0;mso-height-percent:0;mso-width-relative:margin;mso-height-relative:margin;v-text-anchor:top" o:gfxdata="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" filled="f" stroked="f">
+                <v:textbox>
+                  <w:txbxContent>
+                    <w:p>
+                      <w:pPr>
+                        <w:spacing w:after="0"/>
+                        <w:ind w:left="0" w:firstLine="0"/>
+                        <w:jc w:val="center"/>
+                        <w:rPr>
+                          <w:color w:val="3B3838" w:themeColor="background2" w:themeShade="40"/>
+                          <w:sz w:val="18"/>
+                          <w:szCs w:val="18"/>
+                        </w:rPr>
+                      </w:pPr>
+                      <w:r>
+                        <w:rPr>
+                          <w:color w:val="3B3838" w:themeColor="background2" w:themeShade="40"/>
+                          <w:sz w:val="18"/>
+                          <w:szCs w:val="18"/>
+                        </w:rPr>
+                        <w:t xml:space="preserve">Rys. </w:t>
+                      </w:r>
+                      <w:r>
+                        <w:rPr>
+                          <w:color w:val="3B3838" w:themeColor="background2" w:themeShade="40"/>
+                          <w:sz w:val="18"/>
+                          <w:szCs w:val="18"/>
+                        </w:rPr>
+                        <w:t>2</w:t>
+                      </w:r>
+                    </w:p>
+                    <w:p>
+                      <w:pPr>
+                        <w:spacing w:after="0"/>
+                        <w:ind w:left="0" w:firstLine="0"/>
+                        <w:jc w:val="center"/>
+                        <w:rPr>
+                          <w:color w:val="3B3838" w:themeColor="background2" w:themeShade="40"/>
+                          <w:sz w:val="18"/>
+                          <w:szCs w:val="18"/>
+                        </w:rPr>
+                      </w:pPr>
+                      <w:r>
+                        <w:rPr>
+                          <w:color w:val="3B3838" w:themeColor="background2" w:themeShade="40"/>
+                          <w:sz w:val="18"/>
+                          <w:szCs w:val="18"/>
+                        </w:rPr>
+                        <w:t xml:space="preserve">Widok </w:t>
+                      </w:r>
+                      <w:r>
+                        <w:rPr>
+                          <w:color w:val="3B3838" w:themeColor="background2" w:themeShade="40"/>
+                          <w:sz w:val="18"/>
+                          <w:szCs w:val="18"/>
+                        </w:rPr>
+                        <w:t>sformatowanej tabeli ligowej</w:t>
+                      </w:r>
+                    </w:p>
+                  </w:txbxContent>
+                </v:textbox>
+                <w10:wrap type="square" anchorx="margin" anchory="margin"/>
+              </v:shape>
+            </w:pict>
+          </mc:Fallback>
+        </mc:AlternateContent>
+      </w:r>
+    </w:p>
+    <w:p>
+      <w:pPr>
+        <w:spacing w:after="0" w:line="240" w:lineRule="auto"/>
+        <w:ind w:left="0" w:firstLine="0"/>
+        <w:jc w:val="both"/>
+        <w:rPr>
+          <w:b/>
+          <w:bCs/>
+          <w:sz w:val="22"/>
+          <w:szCs w:val="22"/>
+        </w:rPr>
+      </w:pPr>
+    </w:p>
+    <w:p>
+      <w:pPr>
+        <w:spacing w:after="0" w:line="240" w:lineRule="auto"/>
+        <w:ind w:left="0" w:firstLine="0"/>
+        <w:jc w:val="both"/>
+        <w:rPr>
+          <w:b/>
+          <w:bCs/>
+          <w:sz w:val="22"/>
+          <w:szCs w:val="22"/>
+        </w:rPr>
+      </w:pPr>
+    </w:p>
+    <w:p>
+      <w:pPr>
+        <w:spacing w:after="0" w:line="240" w:lineRule="auto"/>
+        <w:ind w:left="0" w:firstLine="0"/>
+        <w:jc w:val="both"/>
+        <w:rPr>
+          <w:b/>
+          <w:bCs/>
+          <w:sz w:val="22"/>
+          <w:szCs w:val="22"/>
+        </w:rPr>
+      </w:pPr>
+    </w:p>
+    <w:p>
+      <w:pPr>
+        <w:spacing w:after="0" w:line="240" w:lineRule="auto"/>
+        <w:ind w:left="0" w:firstLine="0"/>
+        <w:jc w:val="both"/>
+        <w:rPr>
+          <w:b/>
+          <w:bCs/>
+          <w:sz w:val="22"/>
+          <w:szCs w:val="22"/>
+        </w:rPr>
+      </w:pPr>
+    </w:p>
+    <w:p>
+      <w:pPr>
+        <w:spacing w:after="0" w:line="240" w:lineRule="auto"/>
+        <w:ind w:left="0" w:firstLine="0"/>
+        <w:jc w:val="both"/>
+        <w:rPr>
+          <w:b/>
+          <w:bCs/>
+          <w:sz w:val="22"/>
+          <w:szCs w:val="22"/>
+        </w:rPr>
+      </w:pPr>
+    </w:p>
+    <w:p>
+      <w:pPr>
+        <w:spacing w:after="0" w:line="240" w:lineRule="auto"/>
+        <w:ind w:left="0" w:firstLine="0"/>
+        <w:jc w:val="both"/>
+        <w:rPr>
+          <w:b/>
+          <w:bCs/>
+          <w:sz w:val="22"/>
+          <w:szCs w:val="22"/>
+        </w:rPr>
+      </w:pPr>
+    </w:p>
+    <w:p>
+      <w:pPr>
+        <w:spacing w:after="0" w:line="240" w:lineRule="auto"/>
+        <w:ind w:left="0" w:firstLine="0"/>
+        <w:jc w:val="both"/>
+        <w:rPr>
+          <w:b/>
+          <w:bCs/>
+          <w:sz w:val="22"/>
+          <w:szCs w:val="22"/>
+        </w:rPr>
+      </w:pPr>
+    </w:p>
+    <w:p>
+      <w:pPr>
+        <w:spacing w:after="0" w:line="240" w:lineRule="auto"/>
+        <w:ind w:left="0" w:firstLine="0"/>
+        <w:jc w:val="both"/>
+        <w:rPr>
+          <w:b/>
+          <w:bCs/>
+          <w:sz w:val="22"/>
+          <w:szCs w:val="22"/>
+        </w:rPr>
+      </w:pPr>
+    </w:p>
+    <w:p>
+      <w:pPr>
+        <w:spacing w:after="0" w:line="240" w:lineRule="auto"/>
+        <w:ind w:left="0" w:firstLine="0"/>
+        <w:jc w:val="both"/>
+        <w:rPr>
+          <w:b/>
+          <w:bCs/>
+          <w:sz w:val="22"/>
+          <w:szCs w:val="22"/>
+        </w:rPr>
+      </w:pPr>
+    </w:p>
+    <w:p>
+      <w:pPr>
+        <w:spacing w:after="0" w:line="240" w:lineRule="auto"/>
+        <w:ind w:left="0" w:firstLine="0"/>
+        <w:jc w:val="both"/>
+        <w:rPr>
+          <w:b/>
+          <w:bCs/>
+          <w:sz w:val="22"/>
+          <w:szCs w:val="22"/>
+        </w:rPr>
+      </w:pPr>
+    </w:p>
+    <w:p>
+      <w:pPr>
+        <w:spacing w:after="0" w:line="360" w:lineRule="auto"/>
+        <w:ind w:left="0" w:firstLine="0"/>
+        <w:jc w:val="both"/>
+        <w:rPr>
+          <w:b/>
+          <w:bCs/>
+          <w:sz w:val="22"/>
+          <w:szCs w:val="22"/>
+        </w:rPr>
+      </w:pPr>
+    </w:p>
+    <w:p>
+      <w:pPr>
+        <w:spacing w:after="0" w:line="360" w:lineRule="auto"/>
+        <w:ind w:left="0" w:firstLine="0"/>
+        <w:jc w:val="both"/>
+        <w:rPr>
+          <w:b/>
+          <w:bCs/>
+          <w:sz w:val="22"/>
+          <w:szCs w:val="22"/>
+        </w:rPr>
+      </w:pPr>
+      <w:r>
+        <w:rPr>
+          <w:b/>
+          <w:bCs/>
+          <w:sz w:val="22"/>
+          <w:szCs w:val="22"/>
+        </w:rPr>
         <w:t>5. Podział ról</w:t>
       </w:r>
     </w:p>
@@ -2018,23 +3310,21 @@
           <w:sz w:val="20"/>
           <w:szCs w:val="20"/>
         </w:rPr>
-        <w:t xml:space="preserve">Jakub Hlebowicz – stworzenie interfejsu użytkownika, walidacja danych wejściowych, obsługa zapisu i </w:t>
-      </w:r>
-      <w:proofErr w:type="spellStart"/>
-      <w:r>
-        <w:rPr>
-          <w:sz w:val="20"/>
-          <w:szCs w:val="20"/>
-        </w:rPr>
-        <w:t>doczytu</w:t>
-      </w:r>
-      <w:proofErr w:type="spellEnd"/>
-      <w:r>
-        <w:rPr>
-          <w:sz w:val="20"/>
-          <w:szCs w:val="20"/>
-        </w:rPr>
-        <w:t xml:space="preserve"> danych z plików (Interface, Dane)</w:t>
+        <w:t>Jakub Hlebowicz – stworzenie interfejsu użytkownika, walidacja danych wejściowych, obsługa zapisu i o</w:t>
+      </w:r>
+      <w:r>
+        <w:rPr>
+          <w:sz w:val="20"/>
+          <w:szCs w:val="20"/>
+        </w:rPr>
+        <w:t>d</w:t>
+      </w:r>
+      <w:r>
+        <w:rPr>
+          <w:sz w:val="20"/>
+          <w:szCs w:val="20"/>
+        </w:rPr>
+        <w:t>czytu danych z plików (Interface, Dane)</w:t>
       </w:r>
     </w:p>
     <w:p>
@@ -2116,6 +3406,46 @@
           <w:szCs w:val="20"/>
         </w:rPr>
       </w:pPr>
+      <w:r>
+        <w:rPr>
+          <w:sz w:val="20"/>
+          <w:szCs w:val="20"/>
+        </w:rPr>
+        <w:t xml:space="preserve">Współpraca odbywała się z wykorzystaniem narzędzia </w:t>
+      </w:r>
+      <w:proofErr w:type="spellStart"/>
+      <w:r>
+        <w:rPr>
+          <w:sz w:val="20"/>
+          <w:szCs w:val="20"/>
+        </w:rPr>
+        <w:t>github</w:t>
+      </w:r>
+      <w:proofErr w:type="spellEnd"/>
+      <w:r>
+        <w:rPr>
+          <w:sz w:val="20"/>
+          <w:szCs w:val="20"/>
+        </w:rPr>
+        <w:t xml:space="preserve">: </w:t>
+      </w:r>
+      <w:hyperlink r:id="rId10" w:history="1">
+        <w:r>
+          <w:rPr>
+            <w:rStyle w:val="Hipercze"/>
+            <w:sz w:val="20"/>
+            <w:szCs w:val="20"/>
+          </w:rPr>
+          <w:t>https://github.com/HIeBuS/System-Organizacji-Rozgrywek</w:t>
+        </w:r>
+      </w:hyperlink>
+      <w:r>
+        <w:rPr>
+          <w:sz w:val="20"/>
+          <w:szCs w:val="20"/>
+        </w:rPr>
+        <w:t>, dzięki czemu mogliśmy stworzyć spójny projekt nie mając przy tym trudności z dzieleniem się pracą.</w:t>
+      </w:r>
     </w:p>
     <w:sectPr>
       <w:pgSz w:w="11906" w:h="16838"/>
@@ -2242,8 +3572,194 @@
       </w:rPr>
     </w:lvl>
   </w:abstractNum>
+  <w:abstractNum w:abstractNumId="1" w15:restartNumberingAfterBreak="0">
+    <w:nsid w:val="0B0A2C01"/>
+    <w:multiLevelType w:val="hybridMultilevel"/>
+    <w:tmpl w:val="56DA816A"/>
+    <w:lvl w:ilvl="0" w:tplc="2F6CAD1A">
+      <w:start w:val="1"/>
+      <w:numFmt w:val="decimal"/>
+      <w:lvlText w:val="%1."/>
+      <w:lvlJc w:val="left"/>
+      <w:pPr>
+        <w:ind w:left="1074" w:hanging="360"/>
+      </w:pPr>
+      <w:rPr>
+        <w:rFonts w:hint="default"/>
+        <w:b/>
+      </w:rPr>
+    </w:lvl>
+    <w:lvl w:ilvl="1" w:tplc="04150019" w:tentative="1">
+      <w:start w:val="1"/>
+      <w:numFmt w:val="lowerLetter"/>
+      <w:lvlText w:val="%2."/>
+      <w:lvlJc w:val="left"/>
+      <w:pPr>
+        <w:ind w:left="1794" w:hanging="360"/>
+      </w:pPr>
+    </w:lvl>
+    <w:lvl w:ilvl="2" w:tplc="0415001B" w:tentative="1">
+      <w:start w:val="1"/>
+      <w:numFmt w:val="lowerRoman"/>
+      <w:lvlText w:val="%3."/>
+      <w:lvlJc w:val="right"/>
+      <w:pPr>
+        <w:ind w:left="2514" w:hanging="180"/>
+      </w:pPr>
+    </w:lvl>
+    <w:lvl w:ilvl="3" w:tplc="0415000F" w:tentative="1">
+      <w:start w:val="1"/>
+      <w:numFmt w:val="decimal"/>
+      <w:lvlText w:val="%4."/>
+      <w:lvlJc w:val="left"/>
+      <w:pPr>
+        <w:ind w:left="3234" w:hanging="360"/>
+      </w:pPr>
+    </w:lvl>
+    <w:lvl w:ilvl="4" w:tplc="04150019" w:tentative="1">
+      <w:start w:val="1"/>
+      <w:numFmt w:val="lowerLetter"/>
+      <w:lvlText w:val="%5."/>
+      <w:lvlJc w:val="left"/>
+      <w:pPr>
+        <w:ind w:left="3954" w:hanging="360"/>
+      </w:pPr>
+    </w:lvl>
+    <w:lvl w:ilvl="5" w:tplc="0415001B" w:tentative="1">
+      <w:start w:val="1"/>
+      <w:numFmt w:val="lowerRoman"/>
+      <w:lvlText w:val="%6."/>
+      <w:lvlJc w:val="right"/>
+      <w:pPr>
+        <w:ind w:left="4674" w:hanging="180"/>
+      </w:pPr>
+    </w:lvl>
+    <w:lvl w:ilvl="6" w:tplc="0415000F" w:tentative="1">
+      <w:start w:val="1"/>
+      <w:numFmt w:val="decimal"/>
+      <w:lvlText w:val="%7."/>
+      <w:lvlJc w:val="left"/>
+      <w:pPr>
+        <w:ind w:left="5394" w:hanging="360"/>
+      </w:pPr>
+    </w:lvl>
+    <w:lvl w:ilvl="7" w:tplc="04150019" w:tentative="1">
+      <w:start w:val="1"/>
+      <w:numFmt w:val="lowerLetter"/>
+      <w:lvlText w:val="%8."/>
+      <w:lvlJc w:val="left"/>
+      <w:pPr>
+        <w:ind w:left="6114" w:hanging="360"/>
+      </w:pPr>
+    </w:lvl>
+    <w:lvl w:ilvl="8" w:tplc="0415001B" w:tentative="1">
+      <w:start w:val="1"/>
+      <w:numFmt w:val="lowerRoman"/>
+      <w:lvlText w:val="%9."/>
+      <w:lvlJc w:val="right"/>
+      <w:pPr>
+        <w:ind w:left="6834" w:hanging="180"/>
+      </w:pPr>
+    </w:lvl>
+  </w:abstractNum>
+  <w:abstractNum w:abstractNumId="2" w15:restartNumberingAfterBreak="0">
+    <w:nsid w:val="444C4F3B"/>
+    <w:multiLevelType w:val="hybridMultilevel"/>
+    <w:tmpl w:val="B588CE54"/>
+    <w:lvl w:ilvl="0" w:tplc="2F6CAD1A">
+      <w:start w:val="1"/>
+      <w:numFmt w:val="decimal"/>
+      <w:lvlText w:val="%1."/>
+      <w:lvlJc w:val="left"/>
+      <w:pPr>
+        <w:ind w:left="502" w:hanging="360"/>
+      </w:pPr>
+      <w:rPr>
+        <w:rFonts w:hint="default"/>
+        <w:b/>
+      </w:rPr>
+    </w:lvl>
+    <w:lvl w:ilvl="1" w:tplc="04150019" w:tentative="1">
+      <w:start w:val="1"/>
+      <w:numFmt w:val="lowerLetter"/>
+      <w:lvlText w:val="%2."/>
+      <w:lvlJc w:val="left"/>
+      <w:pPr>
+        <w:ind w:left="868" w:hanging="360"/>
+      </w:pPr>
+    </w:lvl>
+    <w:lvl w:ilvl="2" w:tplc="0415001B" w:tentative="1">
+      <w:start w:val="1"/>
+      <w:numFmt w:val="lowerRoman"/>
+      <w:lvlText w:val="%3."/>
+      <w:lvlJc w:val="right"/>
+      <w:pPr>
+        <w:ind w:left="1588" w:hanging="180"/>
+      </w:pPr>
+    </w:lvl>
+    <w:lvl w:ilvl="3" w:tplc="0415000F" w:tentative="1">
+      <w:start w:val="1"/>
+      <w:numFmt w:val="decimal"/>
+      <w:lvlText w:val="%4."/>
+      <w:lvlJc w:val="left"/>
+      <w:pPr>
+        <w:ind w:left="2308" w:hanging="360"/>
+      </w:pPr>
+    </w:lvl>
+    <w:lvl w:ilvl="4" w:tplc="04150019" w:tentative="1">
+      <w:start w:val="1"/>
+      <w:numFmt w:val="lowerLetter"/>
+      <w:lvlText w:val="%5."/>
+      <w:lvlJc w:val="left"/>
+      <w:pPr>
+        <w:ind w:left="3028" w:hanging="360"/>
+      </w:pPr>
+    </w:lvl>
+    <w:lvl w:ilvl="5" w:tplc="0415001B" w:tentative="1">
+      <w:start w:val="1"/>
+      <w:numFmt w:val="lowerRoman"/>
+      <w:lvlText w:val="%6."/>
+      <w:lvlJc w:val="right"/>
+      <w:pPr>
+        <w:ind w:left="3748" w:hanging="180"/>
+      </w:pPr>
+    </w:lvl>
+    <w:lvl w:ilvl="6" w:tplc="0415000F" w:tentative="1">
+      <w:start w:val="1"/>
+      <w:numFmt w:val="decimal"/>
+      <w:lvlText w:val="%7."/>
+      <w:lvlJc w:val="left"/>
+      <w:pPr>
+        <w:ind w:left="4468" w:hanging="360"/>
+      </w:pPr>
+    </w:lvl>
+    <w:lvl w:ilvl="7" w:tplc="04150019" w:tentative="1">
+      <w:start w:val="1"/>
+      <w:numFmt w:val="lowerLetter"/>
+      <w:lvlText w:val="%8."/>
+      <w:lvlJc w:val="left"/>
+      <w:pPr>
+        <w:ind w:left="5188" w:hanging="360"/>
+      </w:pPr>
+    </w:lvl>
+    <w:lvl w:ilvl="8" w:tplc="0415001B" w:tentative="1">
+      <w:start w:val="1"/>
+      <w:numFmt w:val="lowerRoman"/>
+      <w:lvlText w:val="%9."/>
+      <w:lvlJc w:val="right"/>
+      <w:pPr>
+        <w:ind w:left="5908" w:hanging="180"/>
+      </w:pPr>
+    </w:lvl>
+  </w:abstractNum>
   <w:num w:numId="1" w16cid:durableId="1407146033">
     <w:abstractNumId w:val="0"/>
+  </w:num>
+  <w:num w:numId="2" w16cid:durableId="1118185341">
+    <w:abstractNumId w:val="1"/>
+  </w:num>
+  <w:num w:numId="3" w16cid:durableId="302203289">
+    <w:abstractNumId w:val="2"/>
   </w:num>
 </w:numbering>
 </file>
@@ -2863,6 +4379,7 @@
   <w:style w:type="character" w:default="1" w:styleId="Domylnaczcionkaakapitu">
     <w:name w:val="Default Paragraph Font"/>
     <w:uiPriority w:val="1"/>
+    <w:semiHidden/>
     <w:unhideWhenUsed/>
   </w:style>
   <w:style w:type="table" w:default="1" w:styleId="Standardowy">
@@ -3177,6 +4694,40 @@
       <w:spacing w:val="5"/>
     </w:rPr>
   </w:style>
+  <w:style w:type="paragraph" w:styleId="NormalnyWeb">
+    <w:name w:val="Normal (Web)"/>
+    <w:basedOn w:val="Normalny"/>
+    <w:uiPriority w:val="99"/>
+    <w:semiHidden/>
+    <w:unhideWhenUsed/>
+    <w:rsid w:val="00D9501D"/>
+    <w:rPr>
+      <w:rFonts w:ascii="Times New Roman" w:hAnsi="Times New Roman" w:cs="Times New Roman"/>
+    </w:rPr>
+  </w:style>
+  <w:style w:type="character" w:styleId="Hipercze">
+    <w:name w:val="Hyperlink"/>
+    <w:basedOn w:val="Domylnaczcionkaakapitu"/>
+    <w:uiPriority w:val="99"/>
+    <w:unhideWhenUsed/>
+    <w:rsid w:val="000435ED"/>
+    <w:rPr>
+      <w:color w:val="0563C1" w:themeColor="hyperlink"/>
+      <w:u w:val="single"/>
+    </w:rPr>
+  </w:style>
+  <w:style w:type="character" w:styleId="Nierozpoznanawzmianka">
+    <w:name w:val="Unresolved Mention"/>
+    <w:basedOn w:val="Domylnaczcionkaakapitu"/>
+    <w:uiPriority w:val="99"/>
+    <w:semiHidden/>
+    <w:unhideWhenUsed/>
+    <w:rsid w:val="000435ED"/>
+    <w:rPr>
+      <w:color w:val="605E5C"/>
+      <w:shd w:val="clear" w:color="auto" w:fill="E1DFDD"/>
+    </w:rPr>
+  </w:style>
 </w:styles>
 </file>
 

</xml_diff>